<commit_message>
백엔드 Image URL + TimeOut  수정
</commit_message>
<xml_diff>
--- a/report_agent/output/risk_assessment_form/risk_assessment_form_filled.docx
+++ b/report_agent/output/risk_assessment_form/risk_assessment_form_filled.docx
@@ -3182,7 +3182,7 @@
                 <w:sz w:val="12"/>
                 <w:szCs w:val="12"/>
               </w:rPr>
-              <w:t>소화기 가림 박스를 치우고 통로를 확보하였다.</w:t>
+              <w:t>소화기 가림 박스를 치우고 통로를 확보했다.</w:t>
             </w:r>
           </w:p>
         </w:tc>
@@ -4444,7 +4444,7 @@
                 <w:sz w:val="12"/>
                 <w:szCs w:val="12"/>
               </w:rPr>
-              <w:t>조치를 완료하였다.</w:t>
+              <w:t>조치를 완료했다.</w:t>
             </w:r>
           </w:p>
         </w:tc>
@@ -10476,7 +10476,7 @@
                 <w:sz w:val="12"/>
                 <w:szCs w:val="12"/>
               </w:rPr>
-              <w:t>조치가 필요하다.</w:t>
+              <w:t>조치가 필요한 점검이다.</w:t>
             </w:r>
           </w:p>
         </w:tc>
@@ -11733,7 +11733,7 @@
                 <w:sz w:val="12"/>
                 <w:szCs w:val="12"/>
               </w:rPr>
-              <w:t>보호구가 불량 상태이다.</w:t>
+              <w:t>보호구 불량 상태이다.</w:t>
             </w:r>
           </w:p>
         </w:tc>
@@ -14247,7 +14247,7 @@
                 <w:sz w:val="12"/>
                 <w:szCs w:val="12"/>
               </w:rPr>
-              <w:t>조치가 필요하다.</w:t>
+              <w:t>조치가 필요한 점검이다.</w:t>
             </w:r>
           </w:p>
         </w:tc>
@@ -16766,7 +16766,7 @@
                 <w:sz w:val="12"/>
                 <w:szCs w:val="12"/>
               </w:rPr>
-              <w:t>조치가 필요한 점검으로 확인했다.</w:t>
+              <w:t>본 점검에 대해 조치가 필요하다.</w:t>
             </w:r>
           </w:p>
         </w:tc>
@@ -21872,7 +21872,7 @@
                 <w:sz w:val="12"/>
                 <w:szCs w:val="12"/>
               </w:rPr>
-              <w:t>게시판-조치테이블-담당자 배정 보고서 생성</w:t>
+              <w:t>게시판 - 조치 테이블 - 담당자 배정 보고서 생성</w:t>
             </w:r>
           </w:p>
         </w:tc>
@@ -22057,1005 +22057,6 @@
               <w:left w:val="single" w:sz="8" w:space="0" w:color="B7C9D6"/>
               <w:bottom w:val="single" w:sz="8" w:space="0" w:color="000000"/>
               <w:right w:val="nil"/>
-            </w:tcBorders>
-            <w:shd w:val="clear" w:color="000000" w:fill="F7FAFC"/>
-            <w:vAlign w:val="center"/>
-            <w:hideMark/>
-          </w:tcPr>
-          <w:p>
-            <w:pPr>
-              <w:widowControl/>
-              <w:wordWrap/>
-              <w:autoSpaceDE/>
-              <w:autoSpaceDN/>
-              <w:spacing w:after="0" w:line="240" w:lineRule="auto"/>
-              <w:jc w:val="center"/>
-              <w:rPr>
-                <w:rFonts w:ascii="맑은 고딕" w:eastAsia="맑은 고딕" w:hAnsi="맑은 고딕" w:cs="Arial"/>
-                <w:color w:val="000000"/>
-                <w:kern w:val="0"/>
-                <w:sz w:val="12"/>
-                <w:szCs w:val="12"/>
-              </w:rPr>
-            </w:pPr>
-            <w:r>
-              <w:rPr>
-                <w:rFonts w:ascii="맑은 고딕" w:eastAsia="맑은 고딕" w:hAnsi="맑은 고딕" w:cs="Arial"/>
-                <w:color w:val="000000"/>
-                <w:kern w:val="0"/>
-                <w:sz w:val="12"/>
-                <w:szCs w:val="12"/>
-              </w:rPr>
-              <w:t>/static/uploads/action_history_44_20260805161205525013_78ff6b6a.png</w:t>
-            </w:r>
-          </w:p>
-        </w:tc>
-        <w:tc>
-          <w:tcPr>
-            <w:tcW w:w="400" w:type="pct"/>
-            <w:vMerge w:val="restart"/>
-            <w:tcBorders>
-              <w:top w:val="nil"/>
-              <w:left w:val="single" w:sz="8" w:space="0" w:color="B7C9D6"/>
-              <w:bottom w:val="single" w:sz="8" w:space="0" w:color="000000"/>
-              <w:right w:val="nil"/>
-            </w:tcBorders>
-            <w:shd w:val="clear" w:color="000000" w:fill="F7FAFC"/>
-            <w:vAlign w:val="center"/>
-            <w:hideMark/>
-          </w:tcPr>
-          <w:p>
-            <w:pPr>
-              <w:widowControl/>
-              <w:wordWrap/>
-              <w:autoSpaceDE/>
-              <w:autoSpaceDN/>
-              <w:spacing w:after="0" w:line="240" w:lineRule="auto"/>
-              <w:jc w:val="center"/>
-              <w:rPr>
-                <w:rFonts w:ascii="맑은 고딕" w:eastAsia="맑은 고딕" w:hAnsi="맑은 고딕" w:cs="Arial"/>
-                <w:color w:val="000000"/>
-                <w:kern w:val="0"/>
-                <w:sz w:val="12"/>
-                <w:szCs w:val="12"/>
-              </w:rPr>
-            </w:pPr>
-            <w:r>
-              <w:rPr>
-                <w:rFonts w:ascii="맑은 고딕" w:eastAsia="맑은 고딕" w:hAnsi="맑은 고딕" w:cs="Arial"/>
-                <w:color w:val="000000"/>
-                <w:kern w:val="0"/>
-                <w:sz w:val="12"/>
-                <w:szCs w:val="12"/>
-              </w:rPr>
-              <w:t>판교관리자</w:t>
-            </w:r>
-          </w:p>
-        </w:tc>
-        <w:tc>
-          <w:tcPr>
-            <w:tcW w:w="280" w:type="pct"/>
-            <w:vMerge w:val="restart"/>
-            <w:tcBorders>
-              <w:top w:val="nil"/>
-              <w:left w:val="single" w:sz="8" w:space="0" w:color="B7C9D6"/>
-              <w:bottom w:val="single" w:sz="8" w:space="0" w:color="000000"/>
-              <w:right w:val="single" w:sz="8" w:space="0" w:color="auto"/>
-            </w:tcBorders>
-            <w:shd w:val="clear" w:color="000000" w:fill="F7FAFC"/>
-            <w:vAlign w:val="center"/>
-            <w:hideMark/>
-          </w:tcPr>
-          <w:p>
-            <w:pPr>
-              <w:widowControl/>
-              <w:wordWrap/>
-              <w:autoSpaceDE/>
-              <w:autoSpaceDN/>
-              <w:spacing w:after="0" w:line="240" w:lineRule="auto"/>
-              <w:jc w:val="center"/>
-              <w:rPr>
-                <w:rFonts w:ascii="맑은 고딕" w:eastAsia="맑은 고딕" w:hAnsi="맑은 고딕" w:cs="Arial"/>
-                <w:color w:val="000000"/>
-                <w:kern w:val="0"/>
-                <w:sz w:val="12"/>
-                <w:szCs w:val="12"/>
-              </w:rPr>
-            </w:pPr>
-            <w:r>
-              <w:rPr>
-                <w:rFonts w:ascii="맑은 고딕" w:eastAsia="맑은 고딕" w:hAnsi="맑은 고딕" w:cs="Arial"/>
-                <w:color w:val="000000"/>
-                <w:kern w:val="0"/>
-                <w:sz w:val="12"/>
-                <w:szCs w:val="12"/>
-              </w:rPr>
-              <w:t>게시판</w:t>
-            </w:r>
-          </w:p>
-        </w:tc>
-        <w:tc>
-          <w:tcPr>
-            <w:tcW w:w="64" w:type="pct"/>
-            <w:vAlign w:val="center"/>
-            <w:hideMark/>
-          </w:tcPr>
-          <w:p>
-            <w:pPr>
-              <w:widowControl/>
-              <w:wordWrap/>
-              <w:autoSpaceDE/>
-              <w:autoSpaceDN/>
-              <w:spacing w:after="0" w:line="240" w:lineRule="auto"/>
-              <w:jc w:val="left"/>
-              <w:rPr>
-                <w:rFonts w:ascii="Times New Roman" w:eastAsia="Times New Roman" w:hAnsi="Times New Roman" w:cs="Times New Roman"/>
-                <w:kern w:val="0"/>
-                <w:szCs w:val="20"/>
-              </w:rPr>
-            </w:pPr>
-          </w:p>
-        </w:tc>
-      </w:tr>
-      <w:tr>
-        <w:trPr>
-          <w:trHeight w:val="315"/>
-        </w:trPr>
-        <w:tc>
-          <w:tcPr>
-            <w:tcW w:w="234" w:type="pct"/>
-            <w:vMerge/>
-            <w:tcBorders>
-              <w:top w:val="nil"/>
-              <w:bottom w:val="single" w:sz="8" w:space="0" w:color="000000"/>
-              <w:right w:val="single" w:sz="8" w:space="0" w:color="B7C9D6"/>
-            </w:tcBorders>
-            <w:vAlign w:val="center"/>
-            <w:hideMark/>
-          </w:tcPr>
-          <w:p>
-            <w:pPr>
-              <w:widowControl/>
-              <w:wordWrap/>
-              <w:autoSpaceDE/>
-              <w:autoSpaceDN/>
-              <w:spacing w:after="0" w:line="240" w:lineRule="auto"/>
-              <w:jc w:val="left"/>
-              <w:rPr>
-                <w:rFonts w:ascii="맑은 고딕" w:eastAsia="맑은 고딕" w:hAnsi="맑은 고딕" w:cs="Arial"/>
-                <w:color w:val="000000"/>
-                <w:kern w:val="0"/>
-                <w:szCs w:val="20"/>
-              </w:rPr>
-            </w:pPr>
-          </w:p>
-        </w:tc>
-        <w:tc>
-          <w:tcPr>
-            <w:tcW w:w="309" w:type="pct"/>
-            <w:vMerge/>
-            <w:tcBorders>
-              <w:top w:val="nil"/>
-              <w:left w:val="single" w:sz="8" w:space="0" w:color="B7C9D6"/>
-              <w:bottom w:val="single" w:sz="8" w:space="0" w:color="000000"/>
-              <w:right w:val="single" w:sz="8" w:space="0" w:color="B7C9D6"/>
-            </w:tcBorders>
-            <w:vAlign w:val="center"/>
-            <w:hideMark/>
-          </w:tcPr>
-          <w:p>
-            <w:pPr>
-              <w:widowControl/>
-              <w:wordWrap/>
-              <w:autoSpaceDE/>
-              <w:autoSpaceDN/>
-              <w:spacing w:after="0" w:line="240" w:lineRule="auto"/>
-              <w:jc w:val="left"/>
-              <w:rPr>
-                <w:rFonts w:ascii="맑은 고딕" w:eastAsia="맑은 고딕" w:hAnsi="맑은 고딕" w:cs="Arial"/>
-                <w:color w:val="000000"/>
-                <w:kern w:val="0"/>
-                <w:sz w:val="12"/>
-                <w:szCs w:val="12"/>
-              </w:rPr>
-            </w:pPr>
-          </w:p>
-        </w:tc>
-        <w:tc>
-          <w:tcPr>
-            <w:tcW w:w="309" w:type="pct"/>
-            <w:vMerge/>
-            <w:tcBorders>
-              <w:top w:val="nil"/>
-              <w:left w:val="single" w:sz="8" w:space="0" w:color="B7C9D6"/>
-              <w:bottom w:val="single" w:sz="8" w:space="0" w:color="000000"/>
-              <w:right w:val="single" w:sz="8" w:space="0" w:color="B7C9D6"/>
-            </w:tcBorders>
-            <w:vAlign w:val="center"/>
-            <w:hideMark/>
-          </w:tcPr>
-          <w:p>
-            <w:pPr>
-              <w:widowControl/>
-              <w:wordWrap/>
-              <w:autoSpaceDE/>
-              <w:autoSpaceDN/>
-              <w:spacing w:after="0" w:line="240" w:lineRule="auto"/>
-              <w:jc w:val="left"/>
-              <w:rPr>
-                <w:rFonts w:ascii="맑은 고딕" w:eastAsia="맑은 고딕" w:hAnsi="맑은 고딕" w:cs="Arial"/>
-                <w:color w:val="000000"/>
-                <w:kern w:val="0"/>
-                <w:sz w:val="12"/>
-                <w:szCs w:val="12"/>
-              </w:rPr>
-            </w:pPr>
-          </w:p>
-        </w:tc>
-        <w:tc>
-          <w:tcPr>
-            <w:tcW w:w="309" w:type="pct"/>
-            <w:vMerge/>
-            <w:tcBorders>
-              <w:top w:val="nil"/>
-              <w:left w:val="single" w:sz="8" w:space="0" w:color="B7C9D6"/>
-              <w:bottom w:val="single" w:sz="8" w:space="0" w:color="000000"/>
-              <w:right w:val="single" w:sz="8" w:space="0" w:color="B7C9D6"/>
-            </w:tcBorders>
-            <w:vAlign w:val="center"/>
-            <w:hideMark/>
-          </w:tcPr>
-          <w:p>
-            <w:pPr>
-              <w:widowControl/>
-              <w:wordWrap/>
-              <w:autoSpaceDE/>
-              <w:autoSpaceDN/>
-              <w:spacing w:after="0" w:line="240" w:lineRule="auto"/>
-              <w:jc w:val="left"/>
-              <w:rPr>
-                <w:rFonts w:ascii="맑은 고딕" w:eastAsia="맑은 고딕" w:hAnsi="맑은 고딕" w:cs="Arial"/>
-                <w:b/>
-                <w:bCs/>
-                <w:color w:val="000000"/>
-                <w:kern w:val="0"/>
-                <w:sz w:val="12"/>
-                <w:szCs w:val="12"/>
-              </w:rPr>
-            </w:pPr>
-          </w:p>
-        </w:tc>
-        <w:tc>
-          <w:tcPr>
-            <w:tcW w:w="309" w:type="pct"/>
-            <w:vMerge/>
-            <w:tcBorders>
-              <w:top w:val="nil"/>
-              <w:left w:val="single" w:sz="8" w:space="0" w:color="B7C9D6"/>
-              <w:bottom w:val="single" w:sz="8" w:space="0" w:color="000000"/>
-              <w:right w:val="single" w:sz="8" w:space="0" w:color="B7C9D6"/>
-            </w:tcBorders>
-            <w:vAlign w:val="center"/>
-            <w:hideMark/>
-          </w:tcPr>
-          <w:p>
-            <w:pPr>
-              <w:widowControl/>
-              <w:wordWrap/>
-              <w:autoSpaceDE/>
-              <w:autoSpaceDN/>
-              <w:spacing w:after="0" w:line="240" w:lineRule="auto"/>
-              <w:jc w:val="left"/>
-              <w:rPr>
-                <w:rFonts w:ascii="맑은 고딕" w:eastAsia="맑은 고딕" w:hAnsi="맑은 고딕" w:cs="Arial"/>
-                <w:b/>
-                <w:bCs/>
-                <w:color w:val="000000"/>
-                <w:kern w:val="0"/>
-                <w:sz w:val="12"/>
-                <w:szCs w:val="12"/>
-              </w:rPr>
-            </w:pPr>
-          </w:p>
-        </w:tc>
-        <w:tc>
-          <w:tcPr>
-            <w:tcW w:w="311" w:type="pct"/>
-            <w:vMerge/>
-            <w:tcBorders>
-              <w:top w:val="nil"/>
-              <w:left w:val="single" w:sz="8" w:space="0" w:color="B7C9D6"/>
-              <w:bottom w:val="single" w:sz="8" w:space="0" w:color="000000"/>
-              <w:right w:val="single" w:sz="8" w:space="0" w:color="B7C9D6"/>
-            </w:tcBorders>
-            <w:vAlign w:val="center"/>
-            <w:hideMark/>
-          </w:tcPr>
-          <w:p>
-            <w:pPr>
-              <w:widowControl/>
-              <w:wordWrap/>
-              <w:autoSpaceDE/>
-              <w:autoSpaceDN/>
-              <w:spacing w:after="0" w:line="240" w:lineRule="auto"/>
-              <w:jc w:val="left"/>
-              <w:rPr>
-                <w:rFonts w:ascii="맑은 고딕" w:eastAsia="맑은 고딕" w:hAnsi="맑은 고딕" w:cs="Arial"/>
-                <w:b/>
-                <w:bCs/>
-                <w:color w:val="000000"/>
-                <w:kern w:val="0"/>
-                <w:sz w:val="12"/>
-                <w:szCs w:val="12"/>
-              </w:rPr>
-            </w:pPr>
-          </w:p>
-        </w:tc>
-        <w:tc>
-          <w:tcPr>
-            <w:tcW w:w="309" w:type="pct"/>
-            <w:vMerge/>
-            <w:tcBorders>
-              <w:top w:val="nil"/>
-              <w:left w:val="single" w:sz="8" w:space="0" w:color="B7C9D6"/>
-              <w:bottom w:val="single" w:sz="8" w:space="0" w:color="000000"/>
-              <w:right w:val="single" w:sz="8" w:space="0" w:color="B7C9D6"/>
-            </w:tcBorders>
-            <w:vAlign w:val="center"/>
-            <w:hideMark/>
-          </w:tcPr>
-          <w:p>
-            <w:pPr>
-              <w:widowControl/>
-              <w:wordWrap/>
-              <w:autoSpaceDE/>
-              <w:autoSpaceDN/>
-              <w:spacing w:after="0" w:line="240" w:lineRule="auto"/>
-              <w:jc w:val="left"/>
-              <w:rPr>
-                <w:rFonts w:ascii="맑은 고딕" w:eastAsia="맑은 고딕" w:hAnsi="맑은 고딕" w:cs="Arial"/>
-                <w:b/>
-                <w:bCs/>
-                <w:color w:val="000000"/>
-                <w:kern w:val="0"/>
-                <w:sz w:val="12"/>
-                <w:szCs w:val="12"/>
-              </w:rPr>
-            </w:pPr>
-          </w:p>
-        </w:tc>
-        <w:tc>
-          <w:tcPr>
-            <w:tcW w:w="310" w:type="pct"/>
-            <w:vMerge/>
-            <w:tcBorders>
-              <w:top w:val="nil"/>
-              <w:left w:val="single" w:sz="8" w:space="0" w:color="B7C9D6"/>
-              <w:bottom w:val="single" w:sz="8" w:space="0" w:color="000000"/>
-              <w:right w:val="single" w:sz="8" w:space="0" w:color="B7C9D6"/>
-            </w:tcBorders>
-            <w:vAlign w:val="center"/>
-            <w:hideMark/>
-          </w:tcPr>
-          <w:p>
-            <w:pPr>
-              <w:widowControl/>
-              <w:wordWrap/>
-              <w:autoSpaceDE/>
-              <w:autoSpaceDN/>
-              <w:spacing w:after="0" w:line="240" w:lineRule="auto"/>
-              <w:jc w:val="left"/>
-              <w:rPr>
-                <w:rFonts w:ascii="맑은 고딕" w:eastAsia="맑은 고딕" w:hAnsi="맑은 고딕" w:cs="Arial"/>
-                <w:color w:val="000000"/>
-                <w:kern w:val="0"/>
-                <w:sz w:val="12"/>
-                <w:szCs w:val="12"/>
-              </w:rPr>
-            </w:pPr>
-          </w:p>
-        </w:tc>
-        <w:tc>
-          <w:tcPr>
-            <w:tcW w:w="309" w:type="pct"/>
-            <w:vMerge/>
-            <w:tcBorders>
-              <w:top w:val="nil"/>
-              <w:left w:val="single" w:sz="8" w:space="0" w:color="B7C9D6"/>
-              <w:bottom w:val="single" w:sz="8" w:space="0" w:color="000000"/>
-              <w:right w:val="single" w:sz="8" w:space="0" w:color="B7C9D6"/>
-            </w:tcBorders>
-            <w:vAlign w:val="center"/>
-            <w:hideMark/>
-          </w:tcPr>
-          <w:p>
-            <w:pPr>
-              <w:widowControl/>
-              <w:wordWrap/>
-              <w:autoSpaceDE/>
-              <w:autoSpaceDN/>
-              <w:spacing w:after="0" w:line="240" w:lineRule="auto"/>
-              <w:jc w:val="left"/>
-              <w:rPr>
-                <w:rFonts w:ascii="맑은 고딕" w:eastAsia="맑은 고딕" w:hAnsi="맑은 고딕" w:cs="Arial"/>
-                <w:b/>
-                <w:bCs/>
-                <w:color w:val="FFFFFF"/>
-                <w:kern w:val="0"/>
-                <w:sz w:val="12"/>
-                <w:szCs w:val="12"/>
-              </w:rPr>
-            </w:pPr>
-          </w:p>
-        </w:tc>
-        <w:tc>
-          <w:tcPr>
-            <w:tcW w:w="311" w:type="pct"/>
-            <w:vMerge/>
-            <w:tcBorders>
-              <w:top w:val="nil"/>
-              <w:left w:val="single" w:sz="8" w:space="0" w:color="B7C9D6"/>
-              <w:bottom w:val="single" w:sz="8" w:space="0" w:color="000000"/>
-              <w:right w:val="single" w:sz="8" w:space="0" w:color="B7C9D6"/>
-            </w:tcBorders>
-            <w:vAlign w:val="center"/>
-            <w:hideMark/>
-          </w:tcPr>
-          <w:p>
-            <w:pPr>
-              <w:widowControl/>
-              <w:wordWrap/>
-              <w:autoSpaceDE/>
-              <w:autoSpaceDN/>
-              <w:spacing w:after="0" w:line="240" w:lineRule="auto"/>
-              <w:jc w:val="left"/>
-              <w:rPr>
-                <w:rFonts w:ascii="맑은 고딕" w:eastAsia="맑은 고딕" w:hAnsi="맑은 고딕" w:cs="Arial"/>
-                <w:color w:val="000000"/>
-                <w:kern w:val="0"/>
-                <w:szCs w:val="20"/>
-              </w:rPr>
-            </w:pPr>
-          </w:p>
-        </w:tc>
-        <w:tc>
-          <w:tcPr>
-            <w:tcW w:w="309" w:type="pct"/>
-            <w:vMerge/>
-            <w:tcBorders>
-              <w:top w:val="nil"/>
-              <w:left w:val="single" w:sz="8" w:space="0" w:color="B7C9D6"/>
-              <w:bottom w:val="single" w:sz="8" w:space="0" w:color="000000"/>
-              <w:right w:val="single" w:sz="8" w:space="0" w:color="B7C9D6"/>
-            </w:tcBorders>
-            <w:vAlign w:val="center"/>
-            <w:hideMark/>
-          </w:tcPr>
-          <w:p>
-            <w:pPr>
-              <w:widowControl/>
-              <w:wordWrap/>
-              <w:autoSpaceDE/>
-              <w:autoSpaceDN/>
-              <w:spacing w:after="0" w:line="240" w:lineRule="auto"/>
-              <w:jc w:val="left"/>
-              <w:rPr>
-                <w:rFonts w:ascii="맑은 고딕" w:eastAsia="맑은 고딕" w:hAnsi="맑은 고딕" w:cs="Arial"/>
-                <w:b/>
-                <w:bCs/>
-                <w:color w:val="000000"/>
-                <w:kern w:val="0"/>
-                <w:sz w:val="12"/>
-                <w:szCs w:val="12"/>
-              </w:rPr>
-            </w:pPr>
-          </w:p>
-        </w:tc>
-        <w:tc>
-          <w:tcPr>
-            <w:tcW w:w="246" w:type="pct"/>
-            <w:vMerge/>
-            <w:tcBorders>
-              <w:top w:val="nil"/>
-              <w:left w:val="single" w:sz="8" w:space="0" w:color="B7C9D6"/>
-              <w:bottom w:val="single" w:sz="8" w:space="0" w:color="000000"/>
-              <w:right w:val="single" w:sz="8" w:space="0" w:color="B7C9D6"/>
-            </w:tcBorders>
-            <w:vAlign w:val="center"/>
-            <w:hideMark/>
-          </w:tcPr>
-          <w:p>
-            <w:pPr>
-              <w:widowControl/>
-              <w:wordWrap/>
-              <w:autoSpaceDE/>
-              <w:autoSpaceDN/>
-              <w:spacing w:after="0" w:line="240" w:lineRule="auto"/>
-              <w:jc w:val="left"/>
-              <w:rPr>
-                <w:rFonts w:ascii="맑은 고딕" w:eastAsia="맑은 고딕" w:hAnsi="맑은 고딕" w:cs="Arial"/>
-                <w:color w:val="000000"/>
-                <w:kern w:val="0"/>
-                <w:szCs w:val="20"/>
-              </w:rPr>
-            </w:pPr>
-          </w:p>
-        </w:tc>
-        <w:tc>
-          <w:tcPr>
-            <w:tcW w:w="372" w:type="pct"/>
-            <w:vMerge/>
-            <w:tcBorders>
-              <w:top w:val="nil"/>
-              <w:left w:val="single" w:sz="8" w:space="0" w:color="B7C9D6"/>
-              <w:bottom w:val="single" w:sz="8" w:space="0" w:color="000000"/>
-              <w:right w:val="nil"/>
-            </w:tcBorders>
-            <w:vAlign w:val="center"/>
-            <w:hideMark/>
-          </w:tcPr>
-          <w:p>
-            <w:pPr>
-              <w:widowControl/>
-              <w:wordWrap/>
-              <w:autoSpaceDE/>
-              <w:autoSpaceDN/>
-              <w:spacing w:after="0" w:line="240" w:lineRule="auto"/>
-              <w:jc w:val="left"/>
-              <w:rPr>
-                <w:rFonts w:ascii="맑은 고딕" w:eastAsia="맑은 고딕" w:hAnsi="맑은 고딕" w:cs="Arial"/>
-                <w:color w:val="000000"/>
-                <w:kern w:val="0"/>
-                <w:sz w:val="12"/>
-                <w:szCs w:val="12"/>
-              </w:rPr>
-            </w:pPr>
-          </w:p>
-        </w:tc>
-        <w:tc>
-          <w:tcPr>
-            <w:tcW w:w="309" w:type="pct"/>
-            <w:vMerge/>
-            <w:tcBorders>
-              <w:top w:val="nil"/>
-              <w:left w:val="single" w:sz="8" w:space="0" w:color="B7C9D6"/>
-              <w:bottom w:val="single" w:sz="8" w:space="0" w:color="000000"/>
-              <w:right w:val="nil"/>
-            </w:tcBorders>
-            <w:vAlign w:val="center"/>
-            <w:hideMark/>
-          </w:tcPr>
-          <w:p>
-            <w:pPr>
-              <w:widowControl/>
-              <w:wordWrap/>
-              <w:autoSpaceDE/>
-              <w:autoSpaceDN/>
-              <w:spacing w:after="0" w:line="240" w:lineRule="auto"/>
-              <w:jc w:val="left"/>
-              <w:rPr>
-                <w:rFonts w:ascii="맑은 고딕" w:eastAsia="맑은 고딕" w:hAnsi="맑은 고딕" w:cs="Arial"/>
-                <w:color w:val="000000"/>
-                <w:kern w:val="0"/>
-                <w:sz w:val="12"/>
-                <w:szCs w:val="12"/>
-              </w:rPr>
-            </w:pPr>
-          </w:p>
-        </w:tc>
-        <w:tc>
-          <w:tcPr>
-            <w:tcW w:w="400" w:type="pct"/>
-            <w:vMerge/>
-            <w:tcBorders>
-              <w:top w:val="nil"/>
-              <w:left w:val="single" w:sz="8" w:space="0" w:color="B7C9D6"/>
-              <w:bottom w:val="single" w:sz="8" w:space="0" w:color="000000"/>
-              <w:right w:val="nil"/>
-            </w:tcBorders>
-            <w:vAlign w:val="center"/>
-            <w:hideMark/>
-          </w:tcPr>
-          <w:p>
-            <w:pPr>
-              <w:widowControl/>
-              <w:wordWrap/>
-              <w:autoSpaceDE/>
-              <w:autoSpaceDN/>
-              <w:spacing w:after="0" w:line="240" w:lineRule="auto"/>
-              <w:jc w:val="left"/>
-              <w:rPr>
-                <w:rFonts w:ascii="맑은 고딕" w:eastAsia="맑은 고딕" w:hAnsi="맑은 고딕" w:cs="Arial"/>
-                <w:color w:val="000000"/>
-                <w:kern w:val="0"/>
-                <w:sz w:val="12"/>
-                <w:szCs w:val="12"/>
-              </w:rPr>
-            </w:pPr>
-          </w:p>
-        </w:tc>
-        <w:tc>
-          <w:tcPr>
-            <w:tcW w:w="280" w:type="pct"/>
-            <w:vMerge/>
-            <w:tcBorders>
-              <w:top w:val="nil"/>
-              <w:left w:val="single" w:sz="8" w:space="0" w:color="B7C9D6"/>
-              <w:bottom w:val="single" w:sz="8" w:space="0" w:color="000000"/>
-              <w:right w:val="single" w:sz="8" w:space="0" w:color="auto"/>
-            </w:tcBorders>
-            <w:vAlign w:val="center"/>
-            <w:hideMark/>
-          </w:tcPr>
-          <w:p>
-            <w:pPr>
-              <w:widowControl/>
-              <w:wordWrap/>
-              <w:autoSpaceDE/>
-              <w:autoSpaceDN/>
-              <w:spacing w:after="0" w:line="240" w:lineRule="auto"/>
-              <w:jc w:val="left"/>
-              <w:rPr>
-                <w:rFonts w:ascii="맑은 고딕" w:eastAsia="맑은 고딕" w:hAnsi="맑은 고딕" w:cs="Arial"/>
-                <w:color w:val="000000"/>
-                <w:kern w:val="0"/>
-                <w:sz w:val="12"/>
-                <w:szCs w:val="12"/>
-              </w:rPr>
-            </w:pPr>
-          </w:p>
-        </w:tc>
-        <w:tc>
-          <w:tcPr>
-            <w:tcW w:w="64" w:type="pct"/>
-            <w:tcBorders>
-              <w:top w:val="nil"/>
-              <w:left w:val="nil"/>
-              <w:bottom w:val="nil"/>
-              <w:right w:val="nil"/>
-            </w:tcBorders>
-            <w:shd w:val="clear" w:color="auto" w:fill="auto"/>
-            <w:noWrap/>
-            <w:vAlign w:val="bottom"/>
-            <w:hideMark/>
-          </w:tcPr>
-          <w:p>
-            <w:pPr>
-              <w:widowControl/>
-              <w:wordWrap/>
-              <w:autoSpaceDE/>
-              <w:autoSpaceDN/>
-              <w:spacing w:after="0" w:line="240" w:lineRule="auto"/>
-              <w:jc w:val="center"/>
-              <w:rPr>
-                <w:rFonts w:ascii="맑은 고딕" w:eastAsia="맑은 고딕" w:hAnsi="맑은 고딕" w:cs="Arial"/>
-                <w:color w:val="000000"/>
-                <w:kern w:val="0"/>
-                <w:sz w:val="12"/>
-                <w:szCs w:val="12"/>
-              </w:rPr>
-            </w:pPr>
-          </w:p>
-        </w:tc>
-      </w:tr>
-      <w:tr>
-        <w:trPr>
-          <w:trHeight w:val="315"/>
-        </w:trPr>
-        <w:tc>
-          <w:tcPr>
-            <w:tcW w:w="234" w:type="pct"/>
-            <w:vMerge w:val="restart"/>
-            <w:tcBorders>
-              <w:top w:val="nil"/>
-              <w:bottom w:val="single" w:sz="8" w:space="0" w:color="000000"/>
-              <w:right w:val="single" w:sz="8" w:space="0" w:color="B7C9D6"/>
-            </w:tcBorders>
-            <w:shd w:val="clear" w:color="000000" w:fill="F7FAFC"/>
-            <w:vAlign w:val="center"/>
-            <w:hideMark/>
-          </w:tcPr>
-          <w:p>
-            <w:pPr>
-              <w:widowControl/>
-              <w:wordWrap/>
-              <w:autoSpaceDE/>
-              <w:autoSpaceDN/>
-              <w:spacing w:after="0" w:line="240" w:lineRule="auto"/>
-              <w:jc w:val="center"/>
-              <w:rPr>
-                <w:rFonts w:ascii="맑은 고딕" w:eastAsia="맑은 고딕" w:hAnsi="맑은 고딕" w:cs="Arial"/>
-                <w:color w:val="000000"/>
-                <w:kern w:val="0"/>
-                <w:sz w:val="12"/>
-                <w:szCs w:val="12"/>
-              </w:rPr>
-            </w:pPr>
-            <w:r>
-              <w:rPr>
-                <w:rFonts w:ascii="맑은 고딕" w:eastAsia="맑은 고딕" w:hAnsi="맑은 고딕" w:cs="Arial"/>
-                <w:color w:val="000000"/>
-                <w:kern w:val="0"/>
-                <w:sz w:val="12"/>
-                <w:szCs w:val="12"/>
-              </w:rPr>
-              <w:t>소방안전</w:t>
-            </w:r>
-          </w:p>
-        </w:tc>
-        <w:tc>
-          <w:tcPr>
-            <w:tcW w:w="309" w:type="pct"/>
-            <w:vMerge w:val="restart"/>
-            <w:tcBorders>
-              <w:top w:val="nil"/>
-              <w:left w:val="single" w:sz="8" w:space="0" w:color="B7C9D6"/>
-              <w:bottom w:val="single" w:sz="8" w:space="0" w:color="000000"/>
-              <w:right w:val="single" w:sz="8" w:space="0" w:color="B7C9D6"/>
-            </w:tcBorders>
-            <w:shd w:val="clear" w:color="000000" w:fill="F7FAFC"/>
-            <w:vAlign w:val="center"/>
-            <w:hideMark/>
-          </w:tcPr>
-          <w:p>
-            <w:pPr>
-              <w:widowControl/>
-              <w:wordWrap/>
-              <w:autoSpaceDE/>
-              <w:autoSpaceDN/>
-              <w:spacing w:after="0" w:line="240" w:lineRule="auto"/>
-              <w:jc w:val="center"/>
-              <w:rPr>
-                <w:rFonts w:ascii="맑은 고딕" w:eastAsia="맑은 고딕" w:hAnsi="맑은 고딕" w:cs="Arial"/>
-                <w:color w:val="000000"/>
-                <w:kern w:val="0"/>
-                <w:sz w:val="12"/>
-                <w:szCs w:val="12"/>
-              </w:rPr>
-            </w:pPr>
-            <w:r>
-              <w:rPr>
-                <w:rFonts w:ascii="맑은 고딕" w:eastAsia="맑은 고딕" w:hAnsi="맑은 고딕" w:cs="Arial"/>
-                <w:color w:val="000000"/>
-                <w:kern w:val="0"/>
-                <w:sz w:val="12"/>
-                <w:szCs w:val="12"/>
-              </w:rPr>
-              <w:t>중</w:t>
-            </w:r>
-          </w:p>
-        </w:tc>
-        <w:tc>
-          <w:tcPr>
-            <w:tcW w:w="309" w:type="pct"/>
-            <w:vMerge w:val="restart"/>
-            <w:tcBorders>
-              <w:top w:val="nil"/>
-              <w:left w:val="single" w:sz="8" w:space="0" w:color="B7C9D6"/>
-              <w:bottom w:val="single" w:sz="8" w:space="0" w:color="000000"/>
-              <w:right w:val="single" w:sz="8" w:space="0" w:color="B7C9D6"/>
-            </w:tcBorders>
-            <w:shd w:val="clear" w:color="000000" w:fill="F7FAFC"/>
-            <w:vAlign w:val="center"/>
-            <w:hideMark/>
-          </w:tcPr>
-          <w:p>
-            <w:pPr>
-              <w:widowControl/>
-              <w:wordWrap/>
-              <w:autoSpaceDE/>
-              <w:autoSpaceDN/>
-              <w:spacing w:after="0" w:line="240" w:lineRule="auto"/>
-              <w:jc w:val="center"/>
-              <w:rPr>
-                <w:rFonts w:ascii="맑은 고딕" w:eastAsia="맑은 고딕" w:hAnsi="맑은 고딕" w:cs="Arial"/>
-                <w:color w:val="000000"/>
-                <w:kern w:val="0"/>
-                <w:sz w:val="12"/>
-                <w:szCs w:val="12"/>
-              </w:rPr>
-            </w:pPr>
-            <w:r>
-              <w:rPr>
-                <w:rFonts w:ascii="맑은 고딕" w:eastAsia="맑은 고딕" w:hAnsi="맑은 고딕" w:cs="Arial"/>
-                <w:color w:val="000000"/>
-                <w:kern w:val="0"/>
-                <w:sz w:val="12"/>
-                <w:szCs w:val="12"/>
-              </w:rPr>
-              <w:t>현수님</w:t>
-            </w:r>
-          </w:p>
-        </w:tc>
-        <w:tc>
-          <w:tcPr>
-            <w:tcW w:w="309" w:type="pct"/>
-            <w:vMerge w:val="restart"/>
-            <w:tcBorders>
-              <w:top w:val="nil"/>
-              <w:left w:val="single" w:sz="8" w:space="0" w:color="B7C9D6"/>
-              <w:bottom w:val="single" w:sz="8" w:space="0" w:color="000000"/>
-              <w:right w:val="single" w:sz="8" w:space="0" w:color="B7C9D6"/>
-            </w:tcBorders>
-            <w:shd w:val="clear" w:color="000000" w:fill="F7FAFC"/>
-            <w:vAlign w:val="center"/>
-            <w:hideMark/>
-          </w:tcPr>
-          <w:p>
-            <w:pPr>
-              <w:widowControl/>
-              <w:wordWrap/>
-              <w:autoSpaceDE/>
-              <w:autoSpaceDN/>
-              <w:spacing w:after="0" w:line="240" w:lineRule="auto"/>
-              <w:jc w:val="center"/>
-              <w:rPr>
-                <w:rFonts w:ascii="맑은 고딕" w:eastAsia="맑은 고딕" w:hAnsi="맑은 고딕" w:cs="Arial"/>
-                <w:b/>
-                <w:bCs/>
-                <w:color w:val="000000"/>
-                <w:kern w:val="0"/>
-                <w:sz w:val="12"/>
-                <w:szCs w:val="12"/>
-              </w:rPr>
-            </w:pPr>
-            <w:r>
-              <w:rPr>
-                <w:rFonts w:ascii="맑은 고딕" w:eastAsia="맑은 고딕" w:hAnsi="맑은 고딕" w:cs="Arial"/>
-                <w:b/>
-                <w:bCs/>
-                <w:color w:val="000000"/>
-                <w:kern w:val="0"/>
-                <w:sz w:val="12"/>
-                <w:szCs w:val="12"/>
-              </w:rPr>
-            </w:r>
-          </w:p>
-        </w:tc>
-        <w:tc>
-          <w:tcPr>
-            <w:tcW w:w="309" w:type="pct"/>
-            <w:vMerge w:val="restart"/>
-            <w:tcBorders>
-              <w:top w:val="nil"/>
-              <w:left w:val="single" w:sz="8" w:space="0" w:color="B7C9D6"/>
-              <w:bottom w:val="single" w:sz="8" w:space="0" w:color="000000"/>
-              <w:right w:val="single" w:sz="8" w:space="0" w:color="B7C9D6"/>
-            </w:tcBorders>
-            <w:shd w:val="clear" w:color="000000" w:fill="F7FAFC"/>
-            <w:vAlign w:val="center"/>
-            <w:hideMark/>
-          </w:tcPr>
-          <w:p>
-            <w:pPr>
-              <w:widowControl/>
-              <w:wordWrap/>
-              <w:autoSpaceDE/>
-              <w:autoSpaceDN/>
-              <w:spacing w:after="0" w:line="240" w:lineRule="auto"/>
-              <w:jc w:val="center"/>
-              <w:rPr>
-                <w:rFonts w:ascii="맑은 고딕" w:eastAsia="맑은 고딕" w:hAnsi="맑은 고딕" w:cs="Arial"/>
-                <w:b/>
-                <w:bCs/>
-                <w:color w:val="000000"/>
-                <w:kern w:val="0"/>
-                <w:sz w:val="12"/>
-                <w:szCs w:val="12"/>
-              </w:rPr>
-            </w:pPr>
-            <w:r>
-              <w:rPr>
-                <w:rFonts w:ascii="맑은 고딕" w:eastAsia="맑은 고딕" w:hAnsi="맑은 고딕" w:cs="Arial"/>
-                <w:b/>
-                <w:bCs/>
-                <w:color w:val="000000"/>
-                <w:kern w:val="0"/>
-                <w:sz w:val="12"/>
-                <w:szCs w:val="12"/>
-              </w:rPr>
-            </w:r>
-          </w:p>
-        </w:tc>
-        <w:tc>
-          <w:tcPr>
-            <w:tcW w:w="311" w:type="pct"/>
-            <w:vMerge w:val="restart"/>
-            <w:tcBorders>
-              <w:top w:val="nil"/>
-              <w:left w:val="single" w:sz="8" w:space="0" w:color="B7C9D6"/>
-              <w:bottom w:val="single" w:sz="8" w:space="0" w:color="000000"/>
-              <w:right w:val="single" w:sz="8" w:space="0" w:color="B7C9D6"/>
-            </w:tcBorders>
-            <w:shd w:val="clear" w:color="000000" w:fill="F7FAFC"/>
-            <w:vAlign w:val="center"/>
-            <w:hideMark/>
-          </w:tcPr>
-          <w:p>
-            <w:pPr>
-              <w:widowControl/>
-              <w:wordWrap/>
-              <w:autoSpaceDE/>
-              <w:autoSpaceDN/>
-              <w:spacing w:after="0" w:line="240" w:lineRule="auto"/>
-              <w:jc w:val="center"/>
-              <w:rPr>
-                <w:rFonts w:ascii="맑은 고딕" w:eastAsia="맑은 고딕" w:hAnsi="맑은 고딕" w:cs="Arial"/>
-                <w:b/>
-                <w:bCs/>
-                <w:color w:val="000000"/>
-                <w:kern w:val="0"/>
-                <w:sz w:val="12"/>
-                <w:szCs w:val="12"/>
-              </w:rPr>
-            </w:pPr>
-            <w:r>
-              <w:rPr>
-                <w:rFonts w:ascii="맑은 고딕" w:eastAsia="맑은 고딕" w:hAnsi="맑은 고딕" w:cs="Arial"/>
-                <w:b/>
-                <w:bCs/>
-                <w:color w:val="000000"/>
-                <w:kern w:val="0"/>
-                <w:sz w:val="12"/>
-                <w:szCs w:val="12"/>
-              </w:rPr>
-            </w:r>
-          </w:p>
-        </w:tc>
-        <w:tc>
-          <w:tcPr>
-            <w:tcW w:w="309" w:type="pct"/>
-            <w:vMerge w:val="restart"/>
-            <w:tcBorders>
-              <w:top w:val="nil"/>
-              <w:left w:val="single" w:sz="8" w:space="0" w:color="B7C9D6"/>
-              <w:bottom w:val="single" w:sz="8" w:space="0" w:color="000000"/>
-              <w:right w:val="single" w:sz="8" w:space="0" w:color="B7C9D6"/>
-            </w:tcBorders>
-            <w:shd w:val="clear" w:color="000000" w:fill="F7FAFC"/>
-            <w:vAlign w:val="center"/>
-            <w:hideMark/>
-          </w:tcPr>
-          <w:p>
-            <w:pPr>
-              <w:widowControl/>
-              <w:wordWrap/>
-              <w:autoSpaceDE/>
-              <w:autoSpaceDN/>
-              <w:spacing w:after="0" w:line="240" w:lineRule="auto"/>
-              <w:jc w:val="center"/>
-              <w:rPr>
-                <w:rFonts w:ascii="맑은 고딕" w:eastAsia="맑은 고딕" w:hAnsi="맑은 고딕" w:cs="Arial"/>
-                <w:b/>
-                <w:bCs/>
-                <w:color w:val="000000"/>
-                <w:kern w:val="0"/>
-                <w:sz w:val="12"/>
-                <w:szCs w:val="12"/>
-              </w:rPr>
-            </w:pPr>
-            <w:r>
-              <w:rPr>
-                <w:rFonts w:ascii="맑은 고딕" w:eastAsia="맑은 고딕" w:hAnsi="맑은 고딕" w:cs="Arial"/>
-                <w:b/>
-                <w:bCs/>
-                <w:color w:val="000000"/>
-                <w:kern w:val="0"/>
-                <w:sz w:val="12"/>
-                <w:szCs w:val="12"/>
-              </w:rPr>
-            </w:r>
-          </w:p>
-        </w:tc>
-        <w:tc>
-          <w:tcPr>
-            <w:tcW w:w="310" w:type="pct"/>
-            <w:vMerge w:val="restart"/>
-            <w:tcBorders>
-              <w:top w:val="nil"/>
-              <w:left w:val="single" w:sz="8" w:space="0" w:color="B7C9D6"/>
-              <w:bottom w:val="single" w:sz="8" w:space="0" w:color="000000"/>
-              <w:right w:val="single" w:sz="8" w:space="0" w:color="B7C9D6"/>
             </w:tcBorders>
             <w:shd w:val="clear" w:color="000000" w:fill="F7FAFC"/>
             <w:vAlign w:val="center"/>
@@ -23122,266 +22123,6 @@
         </w:tc>
         <w:tc>
           <w:tcPr>
-            <w:tcW w:w="309" w:type="pct"/>
-            <w:vMerge w:val="restart"/>
-            <w:tcBorders>
-              <w:top w:val="nil"/>
-              <w:left w:val="single" w:sz="8" w:space="0" w:color="B7C9D6"/>
-              <w:bottom w:val="single" w:sz="8" w:space="0" w:color="000000"/>
-              <w:right w:val="single" w:sz="8" w:space="0" w:color="B7C9D6"/>
-            </w:tcBorders>
-            <w:shd w:val="clear" w:color="000000" w:fill="F7FAFC"/>
-            <w:vAlign w:val="center"/>
-            <w:hideMark/>
-          </w:tcPr>
-          <w:p>
-            <w:pPr>
-              <w:widowControl/>
-              <w:wordWrap/>
-              <w:autoSpaceDE/>
-              <w:autoSpaceDN/>
-              <w:spacing w:after="0" w:line="240" w:lineRule="auto"/>
-              <w:jc w:val="center"/>
-              <w:rPr>
-                <w:rFonts w:ascii="맑은 고딕" w:eastAsia="맑은 고딕" w:hAnsi="맑은 고딕" w:cs="Arial"/>
-                <w:b/>
-                <w:bCs/>
-                <w:color w:val="FFFFFF"/>
-                <w:kern w:val="0"/>
-                <w:sz w:val="12"/>
-                <w:szCs w:val="12"/>
-              </w:rPr>
-            </w:pPr>
-            <w:r>
-              <w:rPr>
-                <w:rFonts w:ascii="맑은 고딕" w:eastAsia="맑은 고딕" w:hAnsi="맑은 고딕" w:cs="Arial"/>
-                <w:b/>
-                <w:bCs/>
-                <w:color w:val="FFFFFF"/>
-                <w:kern w:val="0"/>
-                <w:sz w:val="12"/>
-                <w:szCs w:val="12"/>
-              </w:rPr>
-              <w:t>리포트 이상 현상</w:t>
-            </w:r>
-          </w:p>
-        </w:tc>
-        <w:tc>
-          <w:tcPr>
-            <w:tcW w:w="311" w:type="pct"/>
-            <w:vMerge w:val="restart"/>
-            <w:tcBorders>
-              <w:top w:val="nil"/>
-              <w:left w:val="single" w:sz="8" w:space="0" w:color="B7C9D6"/>
-              <w:bottom w:val="single" w:sz="8" w:space="0" w:color="000000"/>
-              <w:right w:val="single" w:sz="8" w:space="0" w:color="B7C9D6"/>
-            </w:tcBorders>
-            <w:shd w:val="clear" w:color="000000" w:fill="F7FAFC"/>
-            <w:vAlign w:val="center"/>
-            <w:hideMark/>
-          </w:tcPr>
-          <w:p>
-            <w:pPr>
-              <w:widowControl/>
-              <w:wordWrap/>
-              <w:autoSpaceDE/>
-              <w:autoSpaceDN/>
-              <w:spacing w:after="0" w:line="240" w:lineRule="auto"/>
-              <w:jc w:val="center"/>
-              <w:rPr>
-                <w:rFonts w:ascii="맑은 고딕" w:eastAsia="맑은 고딕" w:hAnsi="맑은 고딕" w:cs="Arial"/>
-                <w:color w:val="000000"/>
-                <w:kern w:val="0"/>
-                <w:sz w:val="12"/>
-                <w:szCs w:val="12"/>
-              </w:rPr>
-            </w:pPr>
-            <w:r>
-              <w:rPr>
-                <w:rFonts w:ascii="맑은 고딕" w:eastAsia="맑은 고딕" w:hAnsi="맑은 고딕" w:cs="Arial"/>
-                <w:color w:val="000000"/>
-                <w:kern w:val="0"/>
-                <w:sz w:val="12"/>
-                <w:szCs w:val="12"/>
-              </w:rPr>
-              <w:t>지원 요청</w:t>
-            </w:r>
-          </w:p>
-        </w:tc>
-        <w:tc>
-          <w:tcPr>
-            <w:tcW w:w="309" w:type="pct"/>
-            <w:vMerge w:val="restart"/>
-            <w:tcBorders>
-              <w:top w:val="nil"/>
-              <w:left w:val="single" w:sz="8" w:space="0" w:color="B7C9D6"/>
-              <w:bottom w:val="single" w:sz="8" w:space="0" w:color="000000"/>
-              <w:right w:val="single" w:sz="8" w:space="0" w:color="B7C9D6"/>
-            </w:tcBorders>
-            <w:shd w:val="clear" w:color="000000" w:fill="F7FAFC"/>
-            <w:vAlign w:val="center"/>
-            <w:hideMark/>
-          </w:tcPr>
-          <w:p>
-            <w:pPr>
-              <w:widowControl/>
-              <w:wordWrap/>
-              <w:autoSpaceDE/>
-              <w:autoSpaceDN/>
-              <w:spacing w:after="0" w:line="240" w:lineRule="auto"/>
-              <w:jc w:val="center"/>
-              <w:rPr>
-                <w:rFonts w:ascii="맑은 고딕" w:eastAsia="맑은 고딕" w:hAnsi="맑은 고딕" w:cs="Arial"/>
-                <w:b/>
-                <w:bCs/>
-                <w:color w:val="000000"/>
-                <w:kern w:val="0"/>
-                <w:sz w:val="12"/>
-                <w:szCs w:val="12"/>
-              </w:rPr>
-            </w:pPr>
-            <w:r>
-              <w:rPr>
-                <w:rFonts w:ascii="맑은 고딕" w:eastAsia="맑은 고딕" w:hAnsi="맑은 고딕" w:cs="Arial"/>
-                <w:b/>
-                <w:bCs/>
-                <w:color w:val="000000"/>
-                <w:kern w:val="0"/>
-                <w:sz w:val="12"/>
-                <w:szCs w:val="12"/>
-              </w:rPr>
-              <w:t>2026-08-05 16:27:01</w:t>
-            </w:r>
-          </w:p>
-        </w:tc>
-        <w:tc>
-          <w:tcPr>
-            <w:tcW w:w="246" w:type="pct"/>
-            <w:vMerge w:val="restart"/>
-            <w:tcBorders>
-              <w:top w:val="nil"/>
-              <w:left w:val="single" w:sz="8" w:space="0" w:color="B7C9D6"/>
-              <w:bottom w:val="single" w:sz="8" w:space="0" w:color="000000"/>
-              <w:right w:val="single" w:sz="8" w:space="0" w:color="B7C9D6"/>
-            </w:tcBorders>
-            <w:shd w:val="clear" w:color="000000" w:fill="F7FAFC"/>
-            <w:vAlign w:val="center"/>
-            <w:hideMark/>
-          </w:tcPr>
-          <w:p>
-            <w:pPr>
-              <w:widowControl/>
-              <w:wordWrap/>
-              <w:autoSpaceDE/>
-              <w:autoSpaceDN/>
-              <w:spacing w:after="0" w:line="240" w:lineRule="auto"/>
-              <w:jc w:val="center"/>
-              <w:rPr>
-                <w:rFonts w:ascii="맑은 고딕" w:eastAsia="맑은 고딕" w:hAnsi="맑은 고딕" w:cs="Arial"/>
-                <w:color w:val="000000"/>
-                <w:kern w:val="0"/>
-                <w:sz w:val="12"/>
-                <w:szCs w:val="12"/>
-              </w:rPr>
-            </w:pPr>
-            <w:r>
-              <w:rPr>
-                <w:rFonts w:ascii="맑은 고딕" w:eastAsia="맑은 고딕" w:hAnsi="맑은 고딕" w:cs="Arial"/>
-                <w:color w:val="000000"/>
-                <w:kern w:val="0"/>
-                <w:sz w:val="12"/>
-                <w:szCs w:val="12"/>
-              </w:rPr>
-              <w:t>작업자24</w:t>
-            </w:r>
-          </w:p>
-        </w:tc>
-        <w:tc>
-          <w:tcPr>
-            <w:tcW w:w="372" w:type="pct"/>
-            <w:vMerge w:val="restart"/>
-            <w:tcBorders>
-              <w:top w:val="nil"/>
-              <w:left w:val="single" w:sz="8" w:space="0" w:color="B7C9D6"/>
-              <w:bottom w:val="single" w:sz="8" w:space="0" w:color="000000"/>
-              <w:right w:val="nil"/>
-            </w:tcBorders>
-            <w:shd w:val="clear" w:color="000000" w:fill="F7FAFC"/>
-            <w:vAlign w:val="center"/>
-            <w:hideMark/>
-          </w:tcPr>
-          <w:p>
-            <w:pPr>
-              <w:widowControl/>
-              <w:wordWrap/>
-              <w:autoSpaceDE/>
-              <w:autoSpaceDN/>
-              <w:spacing w:after="0" w:line="240" w:lineRule="auto"/>
-              <w:jc w:val="center"/>
-              <w:rPr>
-                <w:rFonts w:ascii="맑은 고딕" w:eastAsia="맑은 고딕" w:hAnsi="맑은 고딕" w:cs="Arial"/>
-                <w:color w:val="000000"/>
-                <w:kern w:val="0"/>
-                <w:sz w:val="12"/>
-                <w:szCs w:val="12"/>
-              </w:rPr>
-            </w:pPr>
-            <w:r>
-              <w:rPr>
-                <w:rFonts w:ascii="맑은 고딕" w:eastAsia="맑은 고딕" w:hAnsi="맑은 고딕" w:cs="Arial"/>
-                <w:color w:val="000000"/>
-                <w:kern w:val="0"/>
-                <w:sz w:val="12"/>
-                <w:szCs w:val="12"/>
-              </w:rPr>
-              <w:t>문제를 해결했다.</w:t>
-            </w:r>
-          </w:p>
-        </w:tc>
-        <w:tc>
-          <w:tcPr>
-            <w:tcW w:w="309" w:type="pct"/>
-            <w:vMerge w:val="restart"/>
-            <w:tcBorders>
-              <w:top w:val="nil"/>
-              <w:left w:val="single" w:sz="8" w:space="0" w:color="B7C9D6"/>
-              <w:bottom w:val="single" w:sz="8" w:space="0" w:color="000000"/>
-              <w:right w:val="nil"/>
-            </w:tcBorders>
-            <w:shd w:val="clear" w:color="000000" w:fill="F7FAFC"/>
-            <w:vAlign w:val="center"/>
-            <w:hideMark/>
-          </w:tcPr>
-          <w:p>
-            <w:pPr>
-              <w:widowControl/>
-              <w:wordWrap/>
-              <w:autoSpaceDE/>
-              <w:autoSpaceDN/>
-              <w:spacing w:after="0" w:line="240" w:lineRule="auto"/>
-              <w:jc w:val="center"/>
-              <w:rPr>
-                <w:rFonts w:ascii="맑은 고딕" w:eastAsia="맑은 고딕" w:hAnsi="맑은 고딕" w:cs="Arial"/>
-                <w:color w:val="000000"/>
-                <w:kern w:val="0"/>
-                <w:sz w:val="12"/>
-                <w:szCs w:val="12"/>
-              </w:rPr>
-            </w:pPr>
-            <w:r>
-              <w:rPr>
-                <w:rFonts w:ascii="맑은 고딕" w:eastAsia="맑은 고딕" w:hAnsi="맑은 고딕" w:cs="Arial"/>
-                <w:color w:val="000000"/>
-                <w:kern w:val="0"/>
-                <w:sz w:val="12"/>
-                <w:szCs w:val="12"/>
-              </w:rPr>
-              <w:t>/static/uploads/action_history_45_20260805162700961975_0b300863.png</w:t>
-            </w:r>
-          </w:p>
-        </w:tc>
-        <w:tc>
-          <w:tcPr>
             <w:tcW w:w="400" w:type="pct"/>
             <w:vMerge w:val="restart"/>
             <w:tcBorders>
@@ -24111,7 +22852,7 @@
                 <w:sz w:val="12"/>
                 <w:szCs w:val="12"/>
               </w:rPr>
-              <w:t>하</w:t>
+              <w:t>중</w:t>
             </w:r>
           </w:p>
         </w:tc>
@@ -24153,7 +22894,7 @@
                 <w:sz w:val="12"/>
                 <w:szCs w:val="12"/>
               </w:rPr>
-              <w:t>소화기 위치 확인</w:t>
+              <w:t>현수님</w:t>
             </w:r>
           </w:p>
         </w:tc>
@@ -24375,6 +23116,38 @@
                 <w:sz w:val="12"/>
                 <w:szCs w:val="12"/>
               </w:rPr>
+              <w:drawing>
+                <wp:inline xmlns:a="http://schemas.openxmlformats.org/drawingml/2006/main" xmlns:pic="http://schemas.openxmlformats.org/drawingml/2006/picture">
+                  <wp:extent cx="1143000" cy="1143000"/>
+                  <wp:docPr id="2" name="Picture 2"/>
+                  <wp:cNvGraphicFramePr>
+                    <a:graphicFrameLocks noChangeAspect="1"/>
+                  </wp:cNvGraphicFramePr>
+                  <a:graphic>
+                    <a:graphicData uri="http://schemas.openxmlformats.org/drawingml/2006/picture">
+                      <pic:pic>
+                        <pic:nvPicPr>
+                          <pic:cNvPr id="0" name="image.png"/>
+                          <pic:cNvPicPr/>
+                        </pic:nvPicPr>
+                        <pic:blipFill>
+                          <a:blip r:embed="rId8"/>
+                          <a:stretch>
+                            <a:fillRect/>
+                          </a:stretch>
+                        </pic:blipFill>
+                        <pic:spPr>
+                          <a:xfrm>
+                            <a:off x="0" y="0"/>
+                            <a:ext cx="1143000" cy="1143000"/>
+                          </a:xfrm>
+                          <a:prstGeom prst="rect"/>
+                        </pic:spPr>
+                      </pic:pic>
+                    </a:graphicData>
+                  </a:graphic>
+                </wp:inline>
+              </w:drawing>
             </w:r>
           </w:p>
         </w:tc>
@@ -24420,7 +23193,7 @@
                 <w:sz w:val="12"/>
                 <w:szCs w:val="12"/>
               </w:rPr>
-              <w:t>소화기 위치 확인</w:t>
+              <w:t>리포트 이상 현상</w:t>
             </w:r>
           </w:p>
         </w:tc>
@@ -24462,7 +23235,7 @@
                 <w:sz w:val="12"/>
                 <w:szCs w:val="12"/>
               </w:rPr>
-              <w:t>A동</w:t>
+              <w:t>지원 요청</w:t>
             </w:r>
           </w:p>
         </w:tc>
@@ -24508,7 +23281,7 @@
                 <w:sz w:val="12"/>
                 <w:szCs w:val="12"/>
               </w:rPr>
-              <w:t>2026-08-10 10:19:23</w:t>
+              <w:t>2026-08-05 16:27:01</w:t>
             </w:r>
           </w:p>
         </w:tc>
@@ -24550,7 +23323,7 @@
                 <w:sz w:val="12"/>
                 <w:szCs w:val="12"/>
               </w:rPr>
-              <w:t>작업자10</w:t>
+              <w:t>작업자24</w:t>
             </w:r>
           </w:p>
         </w:tc>
@@ -24592,7 +23365,1296 @@
                 <w:sz w:val="12"/>
                 <w:szCs w:val="12"/>
               </w:rPr>
-              <w:t>소화기를 재배치했다.</w:t>
+              <w:t>문제를 해결했다.</w:t>
+            </w:r>
+          </w:p>
+        </w:tc>
+        <w:tc>
+          <w:tcPr>
+            <w:tcW w:w="309" w:type="pct"/>
+            <w:vMerge w:val="restart"/>
+            <w:tcBorders>
+              <w:top w:val="nil"/>
+              <w:left w:val="single" w:sz="8" w:space="0" w:color="B7C9D6"/>
+              <w:bottom w:val="single" w:sz="8" w:space="0" w:color="000000"/>
+              <w:right w:val="nil"/>
+            </w:tcBorders>
+            <w:shd w:val="clear" w:color="000000" w:fill="F7FAFC"/>
+            <w:vAlign w:val="center"/>
+            <w:hideMark/>
+          </w:tcPr>
+          <w:p>
+            <w:pPr>
+              <w:widowControl/>
+              <w:wordWrap/>
+              <w:autoSpaceDE/>
+              <w:autoSpaceDN/>
+              <w:spacing w:after="0" w:line="240" w:lineRule="auto"/>
+              <w:jc w:val="center"/>
+              <w:rPr>
+                <w:rFonts w:ascii="맑은 고딕" w:eastAsia="맑은 고딕" w:hAnsi="맑은 고딕" w:cs="Arial"/>
+                <w:color w:val="000000"/>
+                <w:kern w:val="0"/>
+                <w:sz w:val="12"/>
+                <w:szCs w:val="12"/>
+              </w:rPr>
+            </w:pPr>
+            <w:r>
+              <w:rPr>
+                <w:rFonts w:ascii="맑은 고딕" w:eastAsia="맑은 고딕" w:hAnsi="맑은 고딕" w:cs="Arial"/>
+                <w:color w:val="000000"/>
+                <w:kern w:val="0"/>
+                <w:sz w:val="12"/>
+                <w:szCs w:val="12"/>
+              </w:rPr>
+              <w:drawing>
+                <wp:inline xmlns:a="http://schemas.openxmlformats.org/drawingml/2006/main" xmlns:pic="http://schemas.openxmlformats.org/drawingml/2006/picture">
+                  <wp:extent cx="1143000" cy="933718"/>
+                  <wp:docPr id="3" name="Picture 3"/>
+                  <wp:cNvGraphicFramePr>
+                    <a:graphicFrameLocks noChangeAspect="1"/>
+                  </wp:cNvGraphicFramePr>
+                  <a:graphic>
+                    <a:graphicData uri="http://schemas.openxmlformats.org/drawingml/2006/picture">
+                      <pic:pic>
+                        <pic:nvPicPr>
+                          <pic:cNvPr id="0" name="image.png"/>
+                          <pic:cNvPicPr/>
+                        </pic:nvPicPr>
+                        <pic:blipFill>
+                          <a:blip r:embed="rId9"/>
+                          <a:stretch>
+                            <a:fillRect/>
+                          </a:stretch>
+                        </pic:blipFill>
+                        <pic:spPr>
+                          <a:xfrm>
+                            <a:off x="0" y="0"/>
+                            <a:ext cx="1143000" cy="933718"/>
+                          </a:xfrm>
+                          <a:prstGeom prst="rect"/>
+                        </pic:spPr>
+                      </pic:pic>
+                    </a:graphicData>
+                  </a:graphic>
+                </wp:inline>
+              </w:drawing>
+            </w:r>
+          </w:p>
+        </w:tc>
+        <w:tc>
+          <w:tcPr>
+            <w:tcW w:w="400" w:type="pct"/>
+            <w:vMerge w:val="restart"/>
+            <w:tcBorders>
+              <w:top w:val="nil"/>
+              <w:left w:val="single" w:sz="8" w:space="0" w:color="B7C9D6"/>
+              <w:bottom w:val="single" w:sz="8" w:space="0" w:color="000000"/>
+              <w:right w:val="nil"/>
+            </w:tcBorders>
+            <w:shd w:val="clear" w:color="000000" w:fill="F7FAFC"/>
+            <w:vAlign w:val="center"/>
+            <w:hideMark/>
+          </w:tcPr>
+          <w:p>
+            <w:pPr>
+              <w:widowControl/>
+              <w:wordWrap/>
+              <w:autoSpaceDE/>
+              <w:autoSpaceDN/>
+              <w:spacing w:after="0" w:line="240" w:lineRule="auto"/>
+              <w:jc w:val="center"/>
+              <w:rPr>
+                <w:rFonts w:ascii="맑은 고딕" w:eastAsia="맑은 고딕" w:hAnsi="맑은 고딕" w:cs="Arial"/>
+                <w:color w:val="000000"/>
+                <w:kern w:val="0"/>
+                <w:sz w:val="12"/>
+                <w:szCs w:val="12"/>
+              </w:rPr>
+            </w:pPr>
+            <w:r>
+              <w:rPr>
+                <w:rFonts w:ascii="맑은 고딕" w:eastAsia="맑은 고딕" w:hAnsi="맑은 고딕" w:cs="Arial"/>
+                <w:color w:val="000000"/>
+                <w:kern w:val="0"/>
+                <w:sz w:val="12"/>
+                <w:szCs w:val="12"/>
+              </w:rPr>
+              <w:t>판교관리자</w:t>
+            </w:r>
+          </w:p>
+        </w:tc>
+        <w:tc>
+          <w:tcPr>
+            <w:tcW w:w="280" w:type="pct"/>
+            <w:vMerge w:val="restart"/>
+            <w:tcBorders>
+              <w:top w:val="nil"/>
+              <w:left w:val="single" w:sz="8" w:space="0" w:color="B7C9D6"/>
+              <w:bottom w:val="single" w:sz="8" w:space="0" w:color="000000"/>
+              <w:right w:val="single" w:sz="8" w:space="0" w:color="auto"/>
+            </w:tcBorders>
+            <w:shd w:val="clear" w:color="000000" w:fill="F7FAFC"/>
+            <w:vAlign w:val="center"/>
+            <w:hideMark/>
+          </w:tcPr>
+          <w:p>
+            <w:pPr>
+              <w:widowControl/>
+              <w:wordWrap/>
+              <w:autoSpaceDE/>
+              <w:autoSpaceDN/>
+              <w:spacing w:after="0" w:line="240" w:lineRule="auto"/>
+              <w:jc w:val="center"/>
+              <w:rPr>
+                <w:rFonts w:ascii="맑은 고딕" w:eastAsia="맑은 고딕" w:hAnsi="맑은 고딕" w:cs="Arial"/>
+                <w:color w:val="000000"/>
+                <w:kern w:val="0"/>
+                <w:sz w:val="12"/>
+                <w:szCs w:val="12"/>
+              </w:rPr>
+            </w:pPr>
+            <w:r>
+              <w:rPr>
+                <w:rFonts w:ascii="맑은 고딕" w:eastAsia="맑은 고딕" w:hAnsi="맑은 고딕" w:cs="Arial"/>
+                <w:color w:val="000000"/>
+                <w:kern w:val="0"/>
+                <w:sz w:val="12"/>
+                <w:szCs w:val="12"/>
+              </w:rPr>
+              <w:t>게시판</w:t>
+            </w:r>
+          </w:p>
+        </w:tc>
+        <w:tc>
+          <w:tcPr>
+            <w:tcW w:w="64" w:type="pct"/>
+            <w:vAlign w:val="center"/>
+            <w:hideMark/>
+          </w:tcPr>
+          <w:p>
+            <w:pPr>
+              <w:widowControl/>
+              <w:wordWrap/>
+              <w:autoSpaceDE/>
+              <w:autoSpaceDN/>
+              <w:spacing w:after="0" w:line="240" w:lineRule="auto"/>
+              <w:jc w:val="left"/>
+              <w:rPr>
+                <w:rFonts w:ascii="Times New Roman" w:eastAsia="Times New Roman" w:hAnsi="Times New Roman" w:cs="Times New Roman"/>
+                <w:kern w:val="0"/>
+                <w:szCs w:val="20"/>
+              </w:rPr>
+            </w:pPr>
+          </w:p>
+        </w:tc>
+      </w:tr>
+      <w:tr>
+        <w:trPr>
+          <w:trHeight w:val="315"/>
+        </w:trPr>
+        <w:tc>
+          <w:tcPr>
+            <w:tcW w:w="234" w:type="pct"/>
+            <w:vMerge/>
+            <w:tcBorders>
+              <w:top w:val="nil"/>
+              <w:bottom w:val="single" w:sz="8" w:space="0" w:color="000000"/>
+              <w:right w:val="single" w:sz="8" w:space="0" w:color="B7C9D6"/>
+            </w:tcBorders>
+            <w:vAlign w:val="center"/>
+            <w:hideMark/>
+          </w:tcPr>
+          <w:p>
+            <w:pPr>
+              <w:widowControl/>
+              <w:wordWrap/>
+              <w:autoSpaceDE/>
+              <w:autoSpaceDN/>
+              <w:spacing w:after="0" w:line="240" w:lineRule="auto"/>
+              <w:jc w:val="left"/>
+              <w:rPr>
+                <w:rFonts w:ascii="맑은 고딕" w:eastAsia="맑은 고딕" w:hAnsi="맑은 고딕" w:cs="Arial"/>
+                <w:color w:val="000000"/>
+                <w:kern w:val="0"/>
+                <w:szCs w:val="20"/>
+              </w:rPr>
+            </w:pPr>
+          </w:p>
+        </w:tc>
+        <w:tc>
+          <w:tcPr>
+            <w:tcW w:w="309" w:type="pct"/>
+            <w:vMerge/>
+            <w:tcBorders>
+              <w:top w:val="nil"/>
+              <w:left w:val="single" w:sz="8" w:space="0" w:color="B7C9D6"/>
+              <w:bottom w:val="single" w:sz="8" w:space="0" w:color="000000"/>
+              <w:right w:val="single" w:sz="8" w:space="0" w:color="B7C9D6"/>
+            </w:tcBorders>
+            <w:vAlign w:val="center"/>
+            <w:hideMark/>
+          </w:tcPr>
+          <w:p>
+            <w:pPr>
+              <w:widowControl/>
+              <w:wordWrap/>
+              <w:autoSpaceDE/>
+              <w:autoSpaceDN/>
+              <w:spacing w:after="0" w:line="240" w:lineRule="auto"/>
+              <w:jc w:val="left"/>
+              <w:rPr>
+                <w:rFonts w:ascii="맑은 고딕" w:eastAsia="맑은 고딕" w:hAnsi="맑은 고딕" w:cs="Arial"/>
+                <w:color w:val="000000"/>
+                <w:kern w:val="0"/>
+                <w:sz w:val="12"/>
+                <w:szCs w:val="12"/>
+              </w:rPr>
+            </w:pPr>
+          </w:p>
+        </w:tc>
+        <w:tc>
+          <w:tcPr>
+            <w:tcW w:w="309" w:type="pct"/>
+            <w:vMerge/>
+            <w:tcBorders>
+              <w:top w:val="nil"/>
+              <w:left w:val="single" w:sz="8" w:space="0" w:color="B7C9D6"/>
+              <w:bottom w:val="single" w:sz="8" w:space="0" w:color="000000"/>
+              <w:right w:val="single" w:sz="8" w:space="0" w:color="B7C9D6"/>
+            </w:tcBorders>
+            <w:vAlign w:val="center"/>
+            <w:hideMark/>
+          </w:tcPr>
+          <w:p>
+            <w:pPr>
+              <w:widowControl/>
+              <w:wordWrap/>
+              <w:autoSpaceDE/>
+              <w:autoSpaceDN/>
+              <w:spacing w:after="0" w:line="240" w:lineRule="auto"/>
+              <w:jc w:val="left"/>
+              <w:rPr>
+                <w:rFonts w:ascii="맑은 고딕" w:eastAsia="맑은 고딕" w:hAnsi="맑은 고딕" w:cs="Arial"/>
+                <w:color w:val="000000"/>
+                <w:kern w:val="0"/>
+                <w:sz w:val="12"/>
+                <w:szCs w:val="12"/>
+              </w:rPr>
+            </w:pPr>
+          </w:p>
+        </w:tc>
+        <w:tc>
+          <w:tcPr>
+            <w:tcW w:w="309" w:type="pct"/>
+            <w:vMerge/>
+            <w:tcBorders>
+              <w:top w:val="nil"/>
+              <w:left w:val="single" w:sz="8" w:space="0" w:color="B7C9D6"/>
+              <w:bottom w:val="single" w:sz="8" w:space="0" w:color="000000"/>
+              <w:right w:val="single" w:sz="8" w:space="0" w:color="B7C9D6"/>
+            </w:tcBorders>
+            <w:vAlign w:val="center"/>
+            <w:hideMark/>
+          </w:tcPr>
+          <w:p>
+            <w:pPr>
+              <w:widowControl/>
+              <w:wordWrap/>
+              <w:autoSpaceDE/>
+              <w:autoSpaceDN/>
+              <w:spacing w:after="0" w:line="240" w:lineRule="auto"/>
+              <w:jc w:val="left"/>
+              <w:rPr>
+                <w:rFonts w:ascii="맑은 고딕" w:eastAsia="맑은 고딕" w:hAnsi="맑은 고딕" w:cs="Arial"/>
+                <w:b/>
+                <w:bCs/>
+                <w:color w:val="000000"/>
+                <w:kern w:val="0"/>
+                <w:sz w:val="12"/>
+                <w:szCs w:val="12"/>
+              </w:rPr>
+            </w:pPr>
+          </w:p>
+        </w:tc>
+        <w:tc>
+          <w:tcPr>
+            <w:tcW w:w="309" w:type="pct"/>
+            <w:vMerge/>
+            <w:tcBorders>
+              <w:top w:val="nil"/>
+              <w:left w:val="single" w:sz="8" w:space="0" w:color="B7C9D6"/>
+              <w:bottom w:val="single" w:sz="8" w:space="0" w:color="000000"/>
+              <w:right w:val="single" w:sz="8" w:space="0" w:color="B7C9D6"/>
+            </w:tcBorders>
+            <w:vAlign w:val="center"/>
+            <w:hideMark/>
+          </w:tcPr>
+          <w:p>
+            <w:pPr>
+              <w:widowControl/>
+              <w:wordWrap/>
+              <w:autoSpaceDE/>
+              <w:autoSpaceDN/>
+              <w:spacing w:after="0" w:line="240" w:lineRule="auto"/>
+              <w:jc w:val="left"/>
+              <w:rPr>
+                <w:rFonts w:ascii="맑은 고딕" w:eastAsia="맑은 고딕" w:hAnsi="맑은 고딕" w:cs="Arial"/>
+                <w:b/>
+                <w:bCs/>
+                <w:color w:val="000000"/>
+                <w:kern w:val="0"/>
+                <w:sz w:val="12"/>
+                <w:szCs w:val="12"/>
+              </w:rPr>
+            </w:pPr>
+          </w:p>
+        </w:tc>
+        <w:tc>
+          <w:tcPr>
+            <w:tcW w:w="311" w:type="pct"/>
+            <w:vMerge/>
+            <w:tcBorders>
+              <w:top w:val="nil"/>
+              <w:left w:val="single" w:sz="8" w:space="0" w:color="B7C9D6"/>
+              <w:bottom w:val="single" w:sz="8" w:space="0" w:color="000000"/>
+              <w:right w:val="single" w:sz="8" w:space="0" w:color="B7C9D6"/>
+            </w:tcBorders>
+            <w:vAlign w:val="center"/>
+            <w:hideMark/>
+          </w:tcPr>
+          <w:p>
+            <w:pPr>
+              <w:widowControl/>
+              <w:wordWrap/>
+              <w:autoSpaceDE/>
+              <w:autoSpaceDN/>
+              <w:spacing w:after="0" w:line="240" w:lineRule="auto"/>
+              <w:jc w:val="left"/>
+              <w:rPr>
+                <w:rFonts w:ascii="맑은 고딕" w:eastAsia="맑은 고딕" w:hAnsi="맑은 고딕" w:cs="Arial"/>
+                <w:b/>
+                <w:bCs/>
+                <w:color w:val="000000"/>
+                <w:kern w:val="0"/>
+                <w:sz w:val="12"/>
+                <w:szCs w:val="12"/>
+              </w:rPr>
+            </w:pPr>
+          </w:p>
+        </w:tc>
+        <w:tc>
+          <w:tcPr>
+            <w:tcW w:w="309" w:type="pct"/>
+            <w:vMerge/>
+            <w:tcBorders>
+              <w:top w:val="nil"/>
+              <w:left w:val="single" w:sz="8" w:space="0" w:color="B7C9D6"/>
+              <w:bottom w:val="single" w:sz="8" w:space="0" w:color="000000"/>
+              <w:right w:val="single" w:sz="8" w:space="0" w:color="B7C9D6"/>
+            </w:tcBorders>
+            <w:vAlign w:val="center"/>
+            <w:hideMark/>
+          </w:tcPr>
+          <w:p>
+            <w:pPr>
+              <w:widowControl/>
+              <w:wordWrap/>
+              <w:autoSpaceDE/>
+              <w:autoSpaceDN/>
+              <w:spacing w:after="0" w:line="240" w:lineRule="auto"/>
+              <w:jc w:val="left"/>
+              <w:rPr>
+                <w:rFonts w:ascii="맑은 고딕" w:eastAsia="맑은 고딕" w:hAnsi="맑은 고딕" w:cs="Arial"/>
+                <w:b/>
+                <w:bCs/>
+                <w:color w:val="000000"/>
+                <w:kern w:val="0"/>
+                <w:sz w:val="12"/>
+                <w:szCs w:val="12"/>
+              </w:rPr>
+            </w:pPr>
+          </w:p>
+        </w:tc>
+        <w:tc>
+          <w:tcPr>
+            <w:tcW w:w="310" w:type="pct"/>
+            <w:vMerge/>
+            <w:tcBorders>
+              <w:top w:val="nil"/>
+              <w:left w:val="single" w:sz="8" w:space="0" w:color="B7C9D6"/>
+              <w:bottom w:val="single" w:sz="8" w:space="0" w:color="000000"/>
+              <w:right w:val="single" w:sz="8" w:space="0" w:color="B7C9D6"/>
+            </w:tcBorders>
+            <w:vAlign w:val="center"/>
+            <w:hideMark/>
+          </w:tcPr>
+          <w:p>
+            <w:pPr>
+              <w:widowControl/>
+              <w:wordWrap/>
+              <w:autoSpaceDE/>
+              <w:autoSpaceDN/>
+              <w:spacing w:after="0" w:line="240" w:lineRule="auto"/>
+              <w:jc w:val="left"/>
+              <w:rPr>
+                <w:rFonts w:ascii="맑은 고딕" w:eastAsia="맑은 고딕" w:hAnsi="맑은 고딕" w:cs="Arial"/>
+                <w:color w:val="000000"/>
+                <w:kern w:val="0"/>
+                <w:sz w:val="12"/>
+                <w:szCs w:val="12"/>
+              </w:rPr>
+            </w:pPr>
+          </w:p>
+        </w:tc>
+        <w:tc>
+          <w:tcPr>
+            <w:tcW w:w="309" w:type="pct"/>
+            <w:vMerge/>
+            <w:tcBorders>
+              <w:top w:val="nil"/>
+              <w:left w:val="single" w:sz="8" w:space="0" w:color="B7C9D6"/>
+              <w:bottom w:val="single" w:sz="8" w:space="0" w:color="000000"/>
+              <w:right w:val="single" w:sz="8" w:space="0" w:color="B7C9D6"/>
+            </w:tcBorders>
+            <w:vAlign w:val="center"/>
+            <w:hideMark/>
+          </w:tcPr>
+          <w:p>
+            <w:pPr>
+              <w:widowControl/>
+              <w:wordWrap/>
+              <w:autoSpaceDE/>
+              <w:autoSpaceDN/>
+              <w:spacing w:after="0" w:line="240" w:lineRule="auto"/>
+              <w:jc w:val="left"/>
+              <w:rPr>
+                <w:rFonts w:ascii="맑은 고딕" w:eastAsia="맑은 고딕" w:hAnsi="맑은 고딕" w:cs="Arial"/>
+                <w:b/>
+                <w:bCs/>
+                <w:color w:val="FFFFFF"/>
+                <w:kern w:val="0"/>
+                <w:sz w:val="12"/>
+                <w:szCs w:val="12"/>
+              </w:rPr>
+            </w:pPr>
+          </w:p>
+        </w:tc>
+        <w:tc>
+          <w:tcPr>
+            <w:tcW w:w="311" w:type="pct"/>
+            <w:vMerge/>
+            <w:tcBorders>
+              <w:top w:val="nil"/>
+              <w:left w:val="single" w:sz="8" w:space="0" w:color="B7C9D6"/>
+              <w:bottom w:val="single" w:sz="8" w:space="0" w:color="000000"/>
+              <w:right w:val="single" w:sz="8" w:space="0" w:color="B7C9D6"/>
+            </w:tcBorders>
+            <w:vAlign w:val="center"/>
+            <w:hideMark/>
+          </w:tcPr>
+          <w:p>
+            <w:pPr>
+              <w:widowControl/>
+              <w:wordWrap/>
+              <w:autoSpaceDE/>
+              <w:autoSpaceDN/>
+              <w:spacing w:after="0" w:line="240" w:lineRule="auto"/>
+              <w:jc w:val="left"/>
+              <w:rPr>
+                <w:rFonts w:ascii="맑은 고딕" w:eastAsia="맑은 고딕" w:hAnsi="맑은 고딕" w:cs="Arial"/>
+                <w:color w:val="000000"/>
+                <w:kern w:val="0"/>
+                <w:szCs w:val="20"/>
+              </w:rPr>
+            </w:pPr>
+          </w:p>
+        </w:tc>
+        <w:tc>
+          <w:tcPr>
+            <w:tcW w:w="309" w:type="pct"/>
+            <w:vMerge/>
+            <w:tcBorders>
+              <w:top w:val="nil"/>
+              <w:left w:val="single" w:sz="8" w:space="0" w:color="B7C9D6"/>
+              <w:bottom w:val="single" w:sz="8" w:space="0" w:color="000000"/>
+              <w:right w:val="single" w:sz="8" w:space="0" w:color="B7C9D6"/>
+            </w:tcBorders>
+            <w:vAlign w:val="center"/>
+            <w:hideMark/>
+          </w:tcPr>
+          <w:p>
+            <w:pPr>
+              <w:widowControl/>
+              <w:wordWrap/>
+              <w:autoSpaceDE/>
+              <w:autoSpaceDN/>
+              <w:spacing w:after="0" w:line="240" w:lineRule="auto"/>
+              <w:jc w:val="left"/>
+              <w:rPr>
+                <w:rFonts w:ascii="맑은 고딕" w:eastAsia="맑은 고딕" w:hAnsi="맑은 고딕" w:cs="Arial"/>
+                <w:b/>
+                <w:bCs/>
+                <w:color w:val="000000"/>
+                <w:kern w:val="0"/>
+                <w:sz w:val="12"/>
+                <w:szCs w:val="12"/>
+              </w:rPr>
+            </w:pPr>
+          </w:p>
+        </w:tc>
+        <w:tc>
+          <w:tcPr>
+            <w:tcW w:w="246" w:type="pct"/>
+            <w:vMerge/>
+            <w:tcBorders>
+              <w:top w:val="nil"/>
+              <w:left w:val="single" w:sz="8" w:space="0" w:color="B7C9D6"/>
+              <w:bottom w:val="single" w:sz="8" w:space="0" w:color="000000"/>
+              <w:right w:val="single" w:sz="8" w:space="0" w:color="B7C9D6"/>
+            </w:tcBorders>
+            <w:vAlign w:val="center"/>
+            <w:hideMark/>
+          </w:tcPr>
+          <w:p>
+            <w:pPr>
+              <w:widowControl/>
+              <w:wordWrap/>
+              <w:autoSpaceDE/>
+              <w:autoSpaceDN/>
+              <w:spacing w:after="0" w:line="240" w:lineRule="auto"/>
+              <w:jc w:val="left"/>
+              <w:rPr>
+                <w:rFonts w:ascii="맑은 고딕" w:eastAsia="맑은 고딕" w:hAnsi="맑은 고딕" w:cs="Arial"/>
+                <w:color w:val="000000"/>
+                <w:kern w:val="0"/>
+                <w:szCs w:val="20"/>
+              </w:rPr>
+            </w:pPr>
+          </w:p>
+        </w:tc>
+        <w:tc>
+          <w:tcPr>
+            <w:tcW w:w="372" w:type="pct"/>
+            <w:vMerge/>
+            <w:tcBorders>
+              <w:top w:val="nil"/>
+              <w:left w:val="single" w:sz="8" w:space="0" w:color="B7C9D6"/>
+              <w:bottom w:val="single" w:sz="8" w:space="0" w:color="000000"/>
+              <w:right w:val="nil"/>
+            </w:tcBorders>
+            <w:vAlign w:val="center"/>
+            <w:hideMark/>
+          </w:tcPr>
+          <w:p>
+            <w:pPr>
+              <w:widowControl/>
+              <w:wordWrap/>
+              <w:autoSpaceDE/>
+              <w:autoSpaceDN/>
+              <w:spacing w:after="0" w:line="240" w:lineRule="auto"/>
+              <w:jc w:val="left"/>
+              <w:rPr>
+                <w:rFonts w:ascii="맑은 고딕" w:eastAsia="맑은 고딕" w:hAnsi="맑은 고딕" w:cs="Arial"/>
+                <w:color w:val="000000"/>
+                <w:kern w:val="0"/>
+                <w:sz w:val="12"/>
+                <w:szCs w:val="12"/>
+              </w:rPr>
+            </w:pPr>
+          </w:p>
+        </w:tc>
+        <w:tc>
+          <w:tcPr>
+            <w:tcW w:w="309" w:type="pct"/>
+            <w:vMerge/>
+            <w:tcBorders>
+              <w:top w:val="nil"/>
+              <w:left w:val="single" w:sz="8" w:space="0" w:color="B7C9D6"/>
+              <w:bottom w:val="single" w:sz="8" w:space="0" w:color="000000"/>
+              <w:right w:val="nil"/>
+            </w:tcBorders>
+            <w:vAlign w:val="center"/>
+            <w:hideMark/>
+          </w:tcPr>
+          <w:p>
+            <w:pPr>
+              <w:widowControl/>
+              <w:wordWrap/>
+              <w:autoSpaceDE/>
+              <w:autoSpaceDN/>
+              <w:spacing w:after="0" w:line="240" w:lineRule="auto"/>
+              <w:jc w:val="left"/>
+              <w:rPr>
+                <w:rFonts w:ascii="맑은 고딕" w:eastAsia="맑은 고딕" w:hAnsi="맑은 고딕" w:cs="Arial"/>
+                <w:color w:val="000000"/>
+                <w:kern w:val="0"/>
+                <w:sz w:val="12"/>
+                <w:szCs w:val="12"/>
+              </w:rPr>
+            </w:pPr>
+          </w:p>
+        </w:tc>
+        <w:tc>
+          <w:tcPr>
+            <w:tcW w:w="400" w:type="pct"/>
+            <w:vMerge/>
+            <w:tcBorders>
+              <w:top w:val="nil"/>
+              <w:left w:val="single" w:sz="8" w:space="0" w:color="B7C9D6"/>
+              <w:bottom w:val="single" w:sz="8" w:space="0" w:color="000000"/>
+              <w:right w:val="nil"/>
+            </w:tcBorders>
+            <w:vAlign w:val="center"/>
+            <w:hideMark/>
+          </w:tcPr>
+          <w:p>
+            <w:pPr>
+              <w:widowControl/>
+              <w:wordWrap/>
+              <w:autoSpaceDE/>
+              <w:autoSpaceDN/>
+              <w:spacing w:after="0" w:line="240" w:lineRule="auto"/>
+              <w:jc w:val="left"/>
+              <w:rPr>
+                <w:rFonts w:ascii="맑은 고딕" w:eastAsia="맑은 고딕" w:hAnsi="맑은 고딕" w:cs="Arial"/>
+                <w:color w:val="000000"/>
+                <w:kern w:val="0"/>
+                <w:sz w:val="12"/>
+                <w:szCs w:val="12"/>
+              </w:rPr>
+            </w:pPr>
+          </w:p>
+        </w:tc>
+        <w:tc>
+          <w:tcPr>
+            <w:tcW w:w="280" w:type="pct"/>
+            <w:vMerge/>
+            <w:tcBorders>
+              <w:top w:val="nil"/>
+              <w:left w:val="single" w:sz="8" w:space="0" w:color="B7C9D6"/>
+              <w:bottom w:val="single" w:sz="8" w:space="0" w:color="000000"/>
+              <w:right w:val="single" w:sz="8" w:space="0" w:color="auto"/>
+            </w:tcBorders>
+            <w:vAlign w:val="center"/>
+            <w:hideMark/>
+          </w:tcPr>
+          <w:p>
+            <w:pPr>
+              <w:widowControl/>
+              <w:wordWrap/>
+              <w:autoSpaceDE/>
+              <w:autoSpaceDN/>
+              <w:spacing w:after="0" w:line="240" w:lineRule="auto"/>
+              <w:jc w:val="left"/>
+              <w:rPr>
+                <w:rFonts w:ascii="맑은 고딕" w:eastAsia="맑은 고딕" w:hAnsi="맑은 고딕" w:cs="Arial"/>
+                <w:color w:val="000000"/>
+                <w:kern w:val="0"/>
+                <w:sz w:val="12"/>
+                <w:szCs w:val="12"/>
+              </w:rPr>
+            </w:pPr>
+          </w:p>
+        </w:tc>
+        <w:tc>
+          <w:tcPr>
+            <w:tcW w:w="64" w:type="pct"/>
+            <w:tcBorders>
+              <w:top w:val="nil"/>
+              <w:left w:val="nil"/>
+              <w:bottom w:val="nil"/>
+              <w:right w:val="nil"/>
+            </w:tcBorders>
+            <w:shd w:val="clear" w:color="auto" w:fill="auto"/>
+            <w:noWrap/>
+            <w:vAlign w:val="bottom"/>
+            <w:hideMark/>
+          </w:tcPr>
+          <w:p>
+            <w:pPr>
+              <w:widowControl/>
+              <w:wordWrap/>
+              <w:autoSpaceDE/>
+              <w:autoSpaceDN/>
+              <w:spacing w:after="0" w:line="240" w:lineRule="auto"/>
+              <w:jc w:val="center"/>
+              <w:rPr>
+                <w:rFonts w:ascii="맑은 고딕" w:eastAsia="맑은 고딕" w:hAnsi="맑은 고딕" w:cs="Arial"/>
+                <w:color w:val="000000"/>
+                <w:kern w:val="0"/>
+                <w:sz w:val="12"/>
+                <w:szCs w:val="12"/>
+              </w:rPr>
+            </w:pPr>
+          </w:p>
+        </w:tc>
+      </w:tr>
+      <w:tr>
+        <w:trPr>
+          <w:trHeight w:val="315"/>
+        </w:trPr>
+        <w:tc>
+          <w:tcPr>
+            <w:tcW w:w="234" w:type="pct"/>
+            <w:vMerge w:val="restart"/>
+            <w:tcBorders>
+              <w:top w:val="nil"/>
+              <w:bottom w:val="single" w:sz="8" w:space="0" w:color="000000"/>
+              <w:right w:val="single" w:sz="8" w:space="0" w:color="B7C9D6"/>
+            </w:tcBorders>
+            <w:shd w:val="clear" w:color="000000" w:fill="F7FAFC"/>
+            <w:vAlign w:val="center"/>
+            <w:hideMark/>
+          </w:tcPr>
+          <w:p>
+            <w:pPr>
+              <w:widowControl/>
+              <w:wordWrap/>
+              <w:autoSpaceDE/>
+              <w:autoSpaceDN/>
+              <w:spacing w:after="0" w:line="240" w:lineRule="auto"/>
+              <w:jc w:val="center"/>
+              <w:rPr>
+                <w:rFonts w:ascii="맑은 고딕" w:eastAsia="맑은 고딕" w:hAnsi="맑은 고딕" w:cs="Arial"/>
+                <w:color w:val="000000"/>
+                <w:kern w:val="0"/>
+                <w:sz w:val="12"/>
+                <w:szCs w:val="12"/>
+              </w:rPr>
+            </w:pPr>
+            <w:r>
+              <w:rPr>
+                <w:rFonts w:ascii="맑은 고딕" w:eastAsia="맑은 고딕" w:hAnsi="맑은 고딕" w:cs="Arial"/>
+                <w:color w:val="000000"/>
+                <w:kern w:val="0"/>
+                <w:sz w:val="12"/>
+                <w:szCs w:val="12"/>
+              </w:rPr>
+              <w:t>소방안전</w:t>
+            </w:r>
+          </w:p>
+        </w:tc>
+        <w:tc>
+          <w:tcPr>
+            <w:tcW w:w="309" w:type="pct"/>
+            <w:vMerge w:val="restart"/>
+            <w:tcBorders>
+              <w:top w:val="nil"/>
+              <w:left w:val="single" w:sz="8" w:space="0" w:color="B7C9D6"/>
+              <w:bottom w:val="single" w:sz="8" w:space="0" w:color="000000"/>
+              <w:right w:val="single" w:sz="8" w:space="0" w:color="B7C9D6"/>
+            </w:tcBorders>
+            <w:shd w:val="clear" w:color="000000" w:fill="F7FAFC"/>
+            <w:vAlign w:val="center"/>
+            <w:hideMark/>
+          </w:tcPr>
+          <w:p>
+            <w:pPr>
+              <w:widowControl/>
+              <w:wordWrap/>
+              <w:autoSpaceDE/>
+              <w:autoSpaceDN/>
+              <w:spacing w:after="0" w:line="240" w:lineRule="auto"/>
+              <w:jc w:val="center"/>
+              <w:rPr>
+                <w:rFonts w:ascii="맑은 고딕" w:eastAsia="맑은 고딕" w:hAnsi="맑은 고딕" w:cs="Arial"/>
+                <w:color w:val="000000"/>
+                <w:kern w:val="0"/>
+                <w:sz w:val="12"/>
+                <w:szCs w:val="12"/>
+              </w:rPr>
+            </w:pPr>
+            <w:r>
+              <w:rPr>
+                <w:rFonts w:ascii="맑은 고딕" w:eastAsia="맑은 고딕" w:hAnsi="맑은 고딕" w:cs="Arial"/>
+                <w:color w:val="000000"/>
+                <w:kern w:val="0"/>
+                <w:sz w:val="12"/>
+                <w:szCs w:val="12"/>
+              </w:rPr>
+              <w:t>하</w:t>
+            </w:r>
+          </w:p>
+        </w:tc>
+        <w:tc>
+          <w:tcPr>
+            <w:tcW w:w="309" w:type="pct"/>
+            <w:vMerge w:val="restart"/>
+            <w:tcBorders>
+              <w:top w:val="nil"/>
+              <w:left w:val="single" w:sz="8" w:space="0" w:color="B7C9D6"/>
+              <w:bottom w:val="single" w:sz="8" w:space="0" w:color="000000"/>
+              <w:right w:val="single" w:sz="8" w:space="0" w:color="B7C9D6"/>
+            </w:tcBorders>
+            <w:shd w:val="clear" w:color="000000" w:fill="F7FAFC"/>
+            <w:vAlign w:val="center"/>
+            <w:hideMark/>
+          </w:tcPr>
+          <w:p>
+            <w:pPr>
+              <w:widowControl/>
+              <w:wordWrap/>
+              <w:autoSpaceDE/>
+              <w:autoSpaceDN/>
+              <w:spacing w:after="0" w:line="240" w:lineRule="auto"/>
+              <w:jc w:val="center"/>
+              <w:rPr>
+                <w:rFonts w:ascii="맑은 고딕" w:eastAsia="맑은 고딕" w:hAnsi="맑은 고딕" w:cs="Arial"/>
+                <w:color w:val="000000"/>
+                <w:kern w:val="0"/>
+                <w:sz w:val="12"/>
+                <w:szCs w:val="12"/>
+              </w:rPr>
+            </w:pPr>
+            <w:r>
+              <w:rPr>
+                <w:rFonts w:ascii="맑은 고딕" w:eastAsia="맑은 고딕" w:hAnsi="맑은 고딕" w:cs="Arial"/>
+                <w:color w:val="000000"/>
+                <w:kern w:val="0"/>
+                <w:sz w:val="12"/>
+                <w:szCs w:val="12"/>
+              </w:rPr>
+              <w:t>소화기 위치 확인</w:t>
+            </w:r>
+          </w:p>
+        </w:tc>
+        <w:tc>
+          <w:tcPr>
+            <w:tcW w:w="309" w:type="pct"/>
+            <w:vMerge w:val="restart"/>
+            <w:tcBorders>
+              <w:top w:val="nil"/>
+              <w:left w:val="single" w:sz="8" w:space="0" w:color="B7C9D6"/>
+              <w:bottom w:val="single" w:sz="8" w:space="0" w:color="000000"/>
+              <w:right w:val="single" w:sz="8" w:space="0" w:color="B7C9D6"/>
+            </w:tcBorders>
+            <w:shd w:val="clear" w:color="000000" w:fill="F7FAFC"/>
+            <w:vAlign w:val="center"/>
+            <w:hideMark/>
+          </w:tcPr>
+          <w:p>
+            <w:pPr>
+              <w:widowControl/>
+              <w:wordWrap/>
+              <w:autoSpaceDE/>
+              <w:autoSpaceDN/>
+              <w:spacing w:after="0" w:line="240" w:lineRule="auto"/>
+              <w:jc w:val="center"/>
+              <w:rPr>
+                <w:rFonts w:ascii="맑은 고딕" w:eastAsia="맑은 고딕" w:hAnsi="맑은 고딕" w:cs="Arial"/>
+                <w:b/>
+                <w:bCs/>
+                <w:color w:val="000000"/>
+                <w:kern w:val="0"/>
+                <w:sz w:val="12"/>
+                <w:szCs w:val="12"/>
+              </w:rPr>
+            </w:pPr>
+            <w:r>
+              <w:rPr>
+                <w:rFonts w:ascii="맑은 고딕" w:eastAsia="맑은 고딕" w:hAnsi="맑은 고딕" w:cs="Arial"/>
+                <w:b/>
+                <w:bCs/>
+                <w:color w:val="000000"/>
+                <w:kern w:val="0"/>
+                <w:sz w:val="12"/>
+                <w:szCs w:val="12"/>
+              </w:rPr>
+            </w:r>
+          </w:p>
+        </w:tc>
+        <w:tc>
+          <w:tcPr>
+            <w:tcW w:w="309" w:type="pct"/>
+            <w:vMerge w:val="restart"/>
+            <w:tcBorders>
+              <w:top w:val="nil"/>
+              <w:left w:val="single" w:sz="8" w:space="0" w:color="B7C9D6"/>
+              <w:bottom w:val="single" w:sz="8" w:space="0" w:color="000000"/>
+              <w:right w:val="single" w:sz="8" w:space="0" w:color="B7C9D6"/>
+            </w:tcBorders>
+            <w:shd w:val="clear" w:color="000000" w:fill="F7FAFC"/>
+            <w:vAlign w:val="center"/>
+            <w:hideMark/>
+          </w:tcPr>
+          <w:p>
+            <w:pPr>
+              <w:widowControl/>
+              <w:wordWrap/>
+              <w:autoSpaceDE/>
+              <w:autoSpaceDN/>
+              <w:spacing w:after="0" w:line="240" w:lineRule="auto"/>
+              <w:jc w:val="center"/>
+              <w:rPr>
+                <w:rFonts w:ascii="맑은 고딕" w:eastAsia="맑은 고딕" w:hAnsi="맑은 고딕" w:cs="Arial"/>
+                <w:b/>
+                <w:bCs/>
+                <w:color w:val="000000"/>
+                <w:kern w:val="0"/>
+                <w:sz w:val="12"/>
+                <w:szCs w:val="12"/>
+              </w:rPr>
+            </w:pPr>
+            <w:r>
+              <w:rPr>
+                <w:rFonts w:ascii="맑은 고딕" w:eastAsia="맑은 고딕" w:hAnsi="맑은 고딕" w:cs="Arial"/>
+                <w:b/>
+                <w:bCs/>
+                <w:color w:val="000000"/>
+                <w:kern w:val="0"/>
+                <w:sz w:val="12"/>
+                <w:szCs w:val="12"/>
+              </w:rPr>
+            </w:r>
+          </w:p>
+        </w:tc>
+        <w:tc>
+          <w:tcPr>
+            <w:tcW w:w="311" w:type="pct"/>
+            <w:vMerge w:val="restart"/>
+            <w:tcBorders>
+              <w:top w:val="nil"/>
+              <w:left w:val="single" w:sz="8" w:space="0" w:color="B7C9D6"/>
+              <w:bottom w:val="single" w:sz="8" w:space="0" w:color="000000"/>
+              <w:right w:val="single" w:sz="8" w:space="0" w:color="B7C9D6"/>
+            </w:tcBorders>
+            <w:shd w:val="clear" w:color="000000" w:fill="F7FAFC"/>
+            <w:vAlign w:val="center"/>
+            <w:hideMark/>
+          </w:tcPr>
+          <w:p>
+            <w:pPr>
+              <w:widowControl/>
+              <w:wordWrap/>
+              <w:autoSpaceDE/>
+              <w:autoSpaceDN/>
+              <w:spacing w:after="0" w:line="240" w:lineRule="auto"/>
+              <w:jc w:val="center"/>
+              <w:rPr>
+                <w:rFonts w:ascii="맑은 고딕" w:eastAsia="맑은 고딕" w:hAnsi="맑은 고딕" w:cs="Arial"/>
+                <w:b/>
+                <w:bCs/>
+                <w:color w:val="000000"/>
+                <w:kern w:val="0"/>
+                <w:sz w:val="12"/>
+                <w:szCs w:val="12"/>
+              </w:rPr>
+            </w:pPr>
+            <w:r>
+              <w:rPr>
+                <w:rFonts w:ascii="맑은 고딕" w:eastAsia="맑은 고딕" w:hAnsi="맑은 고딕" w:cs="Arial"/>
+                <w:b/>
+                <w:bCs/>
+                <w:color w:val="000000"/>
+                <w:kern w:val="0"/>
+                <w:sz w:val="12"/>
+                <w:szCs w:val="12"/>
+              </w:rPr>
+            </w:r>
+          </w:p>
+        </w:tc>
+        <w:tc>
+          <w:tcPr>
+            <w:tcW w:w="309" w:type="pct"/>
+            <w:vMerge w:val="restart"/>
+            <w:tcBorders>
+              <w:top w:val="nil"/>
+              <w:left w:val="single" w:sz="8" w:space="0" w:color="B7C9D6"/>
+              <w:bottom w:val="single" w:sz="8" w:space="0" w:color="000000"/>
+              <w:right w:val="single" w:sz="8" w:space="0" w:color="B7C9D6"/>
+            </w:tcBorders>
+            <w:shd w:val="clear" w:color="000000" w:fill="F7FAFC"/>
+            <w:vAlign w:val="center"/>
+            <w:hideMark/>
+          </w:tcPr>
+          <w:p>
+            <w:pPr>
+              <w:widowControl/>
+              <w:wordWrap/>
+              <w:autoSpaceDE/>
+              <w:autoSpaceDN/>
+              <w:spacing w:after="0" w:line="240" w:lineRule="auto"/>
+              <w:jc w:val="center"/>
+              <w:rPr>
+                <w:rFonts w:ascii="맑은 고딕" w:eastAsia="맑은 고딕" w:hAnsi="맑은 고딕" w:cs="Arial"/>
+                <w:b/>
+                <w:bCs/>
+                <w:color w:val="000000"/>
+                <w:kern w:val="0"/>
+                <w:sz w:val="12"/>
+                <w:szCs w:val="12"/>
+              </w:rPr>
+            </w:pPr>
+            <w:r>
+              <w:rPr>
+                <w:rFonts w:ascii="맑은 고딕" w:eastAsia="맑은 고딕" w:hAnsi="맑은 고딕" w:cs="Arial"/>
+                <w:b/>
+                <w:bCs/>
+                <w:color w:val="000000"/>
+                <w:kern w:val="0"/>
+                <w:sz w:val="12"/>
+                <w:szCs w:val="12"/>
+              </w:rPr>
+            </w:r>
+          </w:p>
+        </w:tc>
+        <w:tc>
+          <w:tcPr>
+            <w:tcW w:w="310" w:type="pct"/>
+            <w:vMerge w:val="restart"/>
+            <w:tcBorders>
+              <w:top w:val="nil"/>
+              <w:left w:val="single" w:sz="8" w:space="0" w:color="B7C9D6"/>
+              <w:bottom w:val="single" w:sz="8" w:space="0" w:color="000000"/>
+              <w:right w:val="single" w:sz="8" w:space="0" w:color="B7C9D6"/>
+            </w:tcBorders>
+            <w:shd w:val="clear" w:color="000000" w:fill="F7FAFC"/>
+            <w:vAlign w:val="center"/>
+            <w:hideMark/>
+          </w:tcPr>
+          <w:p>
+            <w:pPr>
+              <w:widowControl/>
+              <w:wordWrap/>
+              <w:autoSpaceDE/>
+              <w:autoSpaceDN/>
+              <w:spacing w:after="0" w:line="240" w:lineRule="auto"/>
+              <w:jc w:val="center"/>
+              <w:rPr>
+                <w:rFonts w:ascii="맑은 고딕" w:eastAsia="맑은 고딕" w:hAnsi="맑은 고딕" w:cs="Arial"/>
+                <w:color w:val="000000"/>
+                <w:kern w:val="0"/>
+                <w:sz w:val="12"/>
+                <w:szCs w:val="12"/>
+              </w:rPr>
+            </w:pPr>
+            <w:r>
+              <w:rPr>
+                <w:rFonts w:ascii="맑은 고딕" w:eastAsia="맑은 고딕" w:hAnsi="맑은 고딕" w:cs="Arial"/>
+                <w:color w:val="000000"/>
+                <w:kern w:val="0"/>
+                <w:sz w:val="12"/>
+                <w:szCs w:val="12"/>
+              </w:rPr>
+            </w:r>
+          </w:p>
+        </w:tc>
+        <w:tc>
+          <w:tcPr>
+            <w:tcW w:w="309" w:type="pct"/>
+            <w:vMerge w:val="restart"/>
+            <w:tcBorders>
+              <w:top w:val="nil"/>
+              <w:left w:val="single" w:sz="8" w:space="0" w:color="B7C9D6"/>
+              <w:bottom w:val="single" w:sz="8" w:space="0" w:color="000000"/>
+              <w:right w:val="single" w:sz="8" w:space="0" w:color="B7C9D6"/>
+            </w:tcBorders>
+            <w:shd w:val="clear" w:color="000000" w:fill="F7FAFC"/>
+            <w:vAlign w:val="center"/>
+            <w:hideMark/>
+          </w:tcPr>
+          <w:p>
+            <w:pPr>
+              <w:widowControl/>
+              <w:wordWrap/>
+              <w:autoSpaceDE/>
+              <w:autoSpaceDN/>
+              <w:spacing w:after="0" w:line="240" w:lineRule="auto"/>
+              <w:jc w:val="center"/>
+              <w:rPr>
+                <w:rFonts w:ascii="맑은 고딕" w:eastAsia="맑은 고딕" w:hAnsi="맑은 고딕" w:cs="Arial"/>
+                <w:b/>
+                <w:bCs/>
+                <w:color w:val="FFFFFF"/>
+                <w:kern w:val="0"/>
+                <w:sz w:val="12"/>
+                <w:szCs w:val="12"/>
+              </w:rPr>
+            </w:pPr>
+            <w:r>
+              <w:rPr>
+                <w:rFonts w:ascii="맑은 고딕" w:eastAsia="맑은 고딕" w:hAnsi="맑은 고딕" w:cs="Arial"/>
+                <w:b/>
+                <w:bCs/>
+                <w:color w:val="FFFFFF"/>
+                <w:kern w:val="0"/>
+                <w:sz w:val="12"/>
+                <w:szCs w:val="12"/>
+              </w:rPr>
+              <w:t>소화기 위치 확인</w:t>
+            </w:r>
+          </w:p>
+        </w:tc>
+        <w:tc>
+          <w:tcPr>
+            <w:tcW w:w="311" w:type="pct"/>
+            <w:vMerge w:val="restart"/>
+            <w:tcBorders>
+              <w:top w:val="nil"/>
+              <w:left w:val="single" w:sz="8" w:space="0" w:color="B7C9D6"/>
+              <w:bottom w:val="single" w:sz="8" w:space="0" w:color="000000"/>
+              <w:right w:val="single" w:sz="8" w:space="0" w:color="B7C9D6"/>
+            </w:tcBorders>
+            <w:shd w:val="clear" w:color="000000" w:fill="F7FAFC"/>
+            <w:vAlign w:val="center"/>
+            <w:hideMark/>
+          </w:tcPr>
+          <w:p>
+            <w:pPr>
+              <w:widowControl/>
+              <w:wordWrap/>
+              <w:autoSpaceDE/>
+              <w:autoSpaceDN/>
+              <w:spacing w:after="0" w:line="240" w:lineRule="auto"/>
+              <w:jc w:val="center"/>
+              <w:rPr>
+                <w:rFonts w:ascii="맑은 고딕" w:eastAsia="맑은 고딕" w:hAnsi="맑은 고딕" w:cs="Arial"/>
+                <w:color w:val="000000"/>
+                <w:kern w:val="0"/>
+                <w:sz w:val="12"/>
+                <w:szCs w:val="12"/>
+              </w:rPr>
+            </w:pPr>
+            <w:r>
+              <w:rPr>
+                <w:rFonts w:ascii="맑은 고딕" w:eastAsia="맑은 고딕" w:hAnsi="맑은 고딕" w:cs="Arial"/>
+                <w:color w:val="000000"/>
+                <w:kern w:val="0"/>
+                <w:sz w:val="12"/>
+                <w:szCs w:val="12"/>
+              </w:rPr>
+              <w:t>A동</w:t>
+            </w:r>
+          </w:p>
+        </w:tc>
+        <w:tc>
+          <w:tcPr>
+            <w:tcW w:w="309" w:type="pct"/>
+            <w:vMerge w:val="restart"/>
+            <w:tcBorders>
+              <w:top w:val="nil"/>
+              <w:left w:val="single" w:sz="8" w:space="0" w:color="B7C9D6"/>
+              <w:bottom w:val="single" w:sz="8" w:space="0" w:color="000000"/>
+              <w:right w:val="single" w:sz="8" w:space="0" w:color="B7C9D6"/>
+            </w:tcBorders>
+            <w:shd w:val="clear" w:color="000000" w:fill="F7FAFC"/>
+            <w:vAlign w:val="center"/>
+            <w:hideMark/>
+          </w:tcPr>
+          <w:p>
+            <w:pPr>
+              <w:widowControl/>
+              <w:wordWrap/>
+              <w:autoSpaceDE/>
+              <w:autoSpaceDN/>
+              <w:spacing w:after="0" w:line="240" w:lineRule="auto"/>
+              <w:jc w:val="center"/>
+              <w:rPr>
+                <w:rFonts w:ascii="맑은 고딕" w:eastAsia="맑은 고딕" w:hAnsi="맑은 고딕" w:cs="Arial"/>
+                <w:b/>
+                <w:bCs/>
+                <w:color w:val="000000"/>
+                <w:kern w:val="0"/>
+                <w:sz w:val="12"/>
+                <w:szCs w:val="12"/>
+              </w:rPr>
+            </w:pPr>
+            <w:r>
+              <w:rPr>
+                <w:rFonts w:ascii="맑은 고딕" w:eastAsia="맑은 고딕" w:hAnsi="맑은 고딕" w:cs="Arial"/>
+                <w:b/>
+                <w:bCs/>
+                <w:color w:val="000000"/>
+                <w:kern w:val="0"/>
+                <w:sz w:val="12"/>
+                <w:szCs w:val="12"/>
+              </w:rPr>
+              <w:t>2026-08-10 10:19:23</w:t>
+            </w:r>
+          </w:p>
+        </w:tc>
+        <w:tc>
+          <w:tcPr>
+            <w:tcW w:w="246" w:type="pct"/>
+            <w:vMerge w:val="restart"/>
+            <w:tcBorders>
+              <w:top w:val="nil"/>
+              <w:left w:val="single" w:sz="8" w:space="0" w:color="B7C9D6"/>
+              <w:bottom w:val="single" w:sz="8" w:space="0" w:color="000000"/>
+              <w:right w:val="single" w:sz="8" w:space="0" w:color="B7C9D6"/>
+            </w:tcBorders>
+            <w:shd w:val="clear" w:color="000000" w:fill="F7FAFC"/>
+            <w:vAlign w:val="center"/>
+            <w:hideMark/>
+          </w:tcPr>
+          <w:p>
+            <w:pPr>
+              <w:widowControl/>
+              <w:wordWrap/>
+              <w:autoSpaceDE/>
+              <w:autoSpaceDN/>
+              <w:spacing w:after="0" w:line="240" w:lineRule="auto"/>
+              <w:jc w:val="center"/>
+              <w:rPr>
+                <w:rFonts w:ascii="맑은 고딕" w:eastAsia="맑은 고딕" w:hAnsi="맑은 고딕" w:cs="Arial"/>
+                <w:color w:val="000000"/>
+                <w:kern w:val="0"/>
+                <w:sz w:val="12"/>
+                <w:szCs w:val="12"/>
+              </w:rPr>
+            </w:pPr>
+            <w:r>
+              <w:rPr>
+                <w:rFonts w:ascii="맑은 고딕" w:eastAsia="맑은 고딕" w:hAnsi="맑은 고딕" w:cs="Arial"/>
+                <w:color w:val="000000"/>
+                <w:kern w:val="0"/>
+                <w:sz w:val="12"/>
+                <w:szCs w:val="12"/>
+              </w:rPr>
+              <w:t>작업자10</w:t>
+            </w:r>
+          </w:p>
+        </w:tc>
+        <w:tc>
+          <w:tcPr>
+            <w:tcW w:w="372" w:type="pct"/>
+            <w:vMerge w:val="restart"/>
+            <w:tcBorders>
+              <w:top w:val="nil"/>
+              <w:left w:val="single" w:sz="8" w:space="0" w:color="B7C9D6"/>
+              <w:bottom w:val="single" w:sz="8" w:space="0" w:color="000000"/>
+              <w:right w:val="nil"/>
+            </w:tcBorders>
+            <w:shd w:val="clear" w:color="000000" w:fill="F7FAFC"/>
+            <w:vAlign w:val="center"/>
+            <w:hideMark/>
+          </w:tcPr>
+          <w:p>
+            <w:pPr>
+              <w:widowControl/>
+              <w:wordWrap/>
+              <w:autoSpaceDE/>
+              <w:autoSpaceDN/>
+              <w:spacing w:after="0" w:line="240" w:lineRule="auto"/>
+              <w:jc w:val="center"/>
+              <w:rPr>
+                <w:rFonts w:ascii="맑은 고딕" w:eastAsia="맑은 고딕" w:hAnsi="맑은 고딕" w:cs="Arial"/>
+                <w:color w:val="000000"/>
+                <w:kern w:val="0"/>
+                <w:sz w:val="12"/>
+                <w:szCs w:val="12"/>
+              </w:rPr>
+            </w:pPr>
+            <w:r>
+              <w:rPr>
+                <w:rFonts w:ascii="맑은 고딕" w:eastAsia="맑은 고딕" w:hAnsi="맑은 고딕" w:cs="Arial"/>
+                <w:color w:val="000000"/>
+                <w:kern w:val="0"/>
+                <w:sz w:val="12"/>
+                <w:szCs w:val="12"/>
+              </w:rPr>
+              <w:t>소화기 재배치를 완료했다.</w:t>
             </w:r>
           </w:p>
         </w:tc>

</xml_diff>